<commit_message>
Lista de verificacion humana (78 articulos), correcciones de licencia y retractados, tareas del equipo
- verificacion_humana_80.csv: 78 articulos CC BY con el DOI como enlace; guia y plantilla de acuerdo entre revisores.
- Corregido el clasificador de licencias (codigos cortos cc by-nc / cc by-nc-nd) y filtro automatico de retractados.
- Repositorio: 85 articulos (66 CC BY, 17 NC/ND, 2 en conflicto).
- Nuevas rondas de curacion (Sonnet/Haiku), busqueda dirigida de SAXS, casos dificiles y TAREAS.md.
- La clave del modelo y la revision de Codex quedan fuera del repositorio hasta terminar la revision humana.

Co-Authored-By: Claude Sonnet 5.5 <noreply@anthropic.com>
</commit_message>
<xml_diff>
--- a/curation/Repositorio_articulos.docx
+++ b/curation/Repositorio_articulos.docx
@@ -143,7 +143,7 @@
           <w:i w:val="0"/>
           <w:sz w:val="20"/>
         </w:rPr>
-        <w:t>Nivel S · 92 puntos · técnicas útiles: SEM+DLS+zeta+DSC · licencia: conflicto</w:t>
+        <w:t>Nivel S · 92 puntos · técnicas útiles: SEM+DLS+zeta+DSC · licencia: amarillo</w:t>
       </w:r>
     </w:p>
     <w:p>
@@ -486,7 +486,62 @@
           <w:i w:val="0"/>
           <w:sz w:val="20"/>
         </w:rPr>
-        <w:t>Nivel S · 95 puntos · técnicas útiles: SEM+DLS+zeta+FTIR+XRD · licencia: conflicto</w:t>
+        <w:t>Nivel S · 95 puntos · técnicas útiles: SEM+DLS+zeta+FTIR+XRD · licencia: amarillo</w:t>
+      </w:r>
+    </w:p>
+    <w:p>
+      <w:pPr>
+        <w:spacing w:after="0"/>
+        <w:ind w:left="720" w:hanging="720"/>
+      </w:pPr>
+      <w:r>
+        <w:t xml:space="preserve">Essa, D., Kondiah, P. P. D., Kumar, P., &amp; Choonara, Y. E. (2023). Design of Chitosan-Coated, Quercetin-Loaded PLGA Nanoparticles for Enhanced PSMA-Specific Activity on LnCap Prostate Cancer Cells. </w:t>
+      </w:r>
+      <w:r>
+        <w:rPr>
+          <w:i/>
+        </w:rPr>
+        <w:t>Biomedicines</w:t>
+      </w:r>
+      <w:r>
+        <w:t xml:space="preserve">, </w:t>
+      </w:r>
+      <w:r>
+        <w:rPr>
+          <w:i/>
+        </w:rPr>
+        <w:t>11</w:t>
+      </w:r>
+      <w:r>
+        <w:t>(4)</w:t>
+      </w:r>
+      <w:r>
+        <w:t>, 1201</w:t>
+      </w:r>
+      <w:r>
+        <w:t xml:space="preserve">. </w:t>
+      </w:r>
+      <w:hyperlink r:id="rId17">
+        <w:r>
+          <w:rPr>
+            <w:color w:val="0563C1"/>
+            <w:u w:val="single"/>
+          </w:rPr>
+          <w:t xml:space="preserve">https://doi.org/10.3390/biomedicines11041201</w:t>
+        </w:r>
+      </w:hyperlink>
+    </w:p>
+    <w:p>
+      <w:pPr>
+        <w:spacing w:after="160"/>
+        <w:ind w:left="720"/>
+      </w:pPr>
+      <w:r>
+        <w:rPr>
+          <w:i w:val="0"/>
+          <w:sz w:val="20"/>
+        </w:rPr>
+        <w:t>Nivel S · 85 puntos · técnicas útiles: SEM+DLS+zeta+FTIR+XRD+TGA · licencia: verde</w:t>
       </w:r>
     </w:p>
     <w:p>
@@ -522,7 +577,7 @@
       <w:r>
         <w:t xml:space="preserve">. </w:t>
       </w:r>
-      <w:hyperlink r:id="rId17">
+      <w:hyperlink r:id="rId18">
         <w:r>
           <w:rPr>
             <w:color w:val="0563C1"/>
@@ -577,7 +632,7 @@
       <w:r>
         <w:t xml:space="preserve">. </w:t>
       </w:r>
-      <w:hyperlink r:id="rId18">
+      <w:hyperlink r:id="rId19">
         <w:r>
           <w:rPr>
             <w:color w:val="0563C1"/>
@@ -632,7 +687,7 @@
       <w:r>
         <w:t xml:space="preserve">. </w:t>
       </w:r>
-      <w:hyperlink r:id="rId19">
+      <w:hyperlink r:id="rId20">
         <w:r>
           <w:rPr>
             <w:color w:val="0563C1"/>
@@ -652,7 +707,7 @@
           <w:i w:val="0"/>
           <w:sz w:val="20"/>
         </w:rPr>
-        <w:t>Nivel A · 80 puntos · técnicas útiles: TEM+DLS+zeta · licencia: conflicto</w:t>
+        <w:t>Nivel A · 80 puntos · técnicas útiles: TEM+DLS+zeta · licencia: amarillo</w:t>
       </w:r>
     </w:p>
     <w:p>
@@ -684,7 +739,7 @@
       <w:r>
         <w:t xml:space="preserve">. </w:t>
       </w:r>
-      <w:hyperlink r:id="rId20">
+      <w:hyperlink r:id="rId21">
         <w:r>
           <w:rPr>
             <w:color w:val="0563C1"/>
@@ -704,7 +759,117 @@
           <w:i w:val="0"/>
           <w:sz w:val="20"/>
         </w:rPr>
-        <w:t>Nivel A · 80 puntos · técnicas útiles: TEM+DLS+zeta · licencia: conflicto</w:t>
+        <w:t>Nivel A · 80 puntos · técnicas útiles: TEM+DLS+zeta · licencia: amarillo</w:t>
+      </w:r>
+    </w:p>
+    <w:p>
+      <w:pPr>
+        <w:spacing w:after="0"/>
+        <w:ind w:left="720" w:hanging="720"/>
+      </w:pPr>
+      <w:r>
+        <w:t xml:space="preserve">Zou, T., Nonappa, N., Khavani, M., Vuorte, M., Penttilä, P., Zitting, A., Valle-Delgado, J. J., Elert, A. M., Silbernagl, D., Balakshin, M., Sammalkorpi, M., &amp; Österberg, M. (2021). Experimental and Simulation Study of the Solvent Effects on the Intrinsic Properties of Spherical Lignin Nanoparticles. </w:t>
+      </w:r>
+      <w:r>
+        <w:rPr>
+          <w:i/>
+        </w:rPr>
+        <w:t>The Journal of Physical Chemistry B</w:t>
+      </w:r>
+      <w:r>
+        <w:t xml:space="preserve">, </w:t>
+      </w:r>
+      <w:r>
+        <w:rPr>
+          <w:i/>
+        </w:rPr>
+        <w:t>125</w:t>
+      </w:r>
+      <w:r>
+        <w:t>(44)</w:t>
+      </w:r>
+      <w:r>
+        <w:t>, 12315-12328</w:t>
+      </w:r>
+      <w:r>
+        <w:t xml:space="preserve">. </w:t>
+      </w:r>
+      <w:hyperlink r:id="rId22">
+        <w:r>
+          <w:rPr>
+            <w:color w:val="0563C1"/>
+            <w:u w:val="single"/>
+          </w:rPr>
+          <w:t xml:space="preserve">https://doi.org/10.1021/acs.jpcb.1c05319</w:t>
+        </w:r>
+      </w:hyperlink>
+    </w:p>
+    <w:p>
+      <w:pPr>
+        <w:spacing w:after="160"/>
+        <w:ind w:left="720"/>
+      </w:pPr>
+      <w:r>
+        <w:rPr>
+          <w:i w:val="0"/>
+          <w:sz w:val="20"/>
+        </w:rPr>
+        <w:t>Nivel A · 80 puntos · técnicas útiles: cryo+DLS+zeta · licencia: verde</w:t>
+      </w:r>
+    </w:p>
+    <w:p>
+      <w:pPr>
+        <w:spacing w:after="0"/>
+        <w:ind w:left="720" w:hanging="720"/>
+      </w:pPr>
+      <w:r>
+        <w:t xml:space="preserve">Bazylińska, U., Wawrzyńczyk, D., Kulbacka, J., Picci, G., Manni, L. S., Handschin, S., Fornasier, M., Caltagirone, C., Mezzenga, R., &amp; Murgia, S. (2022). Hybrid Theranostic Cubosomes for Efficient NIR-Induced Photodynamic Therapy. </w:t>
+      </w:r>
+      <w:r>
+        <w:rPr>
+          <w:i/>
+        </w:rPr>
+        <w:t>ACS Nano</w:t>
+      </w:r>
+      <w:r>
+        <w:t xml:space="preserve">, </w:t>
+      </w:r>
+      <w:r>
+        <w:rPr>
+          <w:i/>
+        </w:rPr>
+        <w:t>16</w:t>
+      </w:r>
+      <w:r>
+        <w:t>(4)</w:t>
+      </w:r>
+      <w:r>
+        <w:t>, 5427-5438</w:t>
+      </w:r>
+      <w:r>
+        <w:t xml:space="preserve">. </w:t>
+      </w:r>
+      <w:hyperlink r:id="rId23">
+        <w:r>
+          <w:rPr>
+            <w:color w:val="0563C1"/>
+            <w:u w:val="single"/>
+          </w:rPr>
+          <w:t xml:space="preserve">https://doi.org/10.1021/acsnano.1c09367</w:t>
+        </w:r>
+      </w:hyperlink>
+    </w:p>
+    <w:p>
+      <w:pPr>
+        <w:spacing w:after="160"/>
+        <w:ind w:left="720"/>
+      </w:pPr>
+      <w:r>
+        <w:rPr>
+          <w:i w:val="0"/>
+          <w:sz w:val="20"/>
+        </w:rPr>
+        <w:t>Nivel A · 80 puntos · técnicas útiles: cryo+DLS+zeta · licencia: verde</w:t>
       </w:r>
     </w:p>
     <w:p>
@@ -736,7 +901,7 @@
       <w:r>
         <w:t xml:space="preserve">. </w:t>
       </w:r>
-      <w:hyperlink r:id="rId21">
+      <w:hyperlink r:id="rId24">
         <w:r>
           <w:rPr>
             <w:color w:val="0563C1"/>
@@ -791,7 +956,7 @@
       <w:r>
         <w:t xml:space="preserve">. </w:t>
       </w:r>
-      <w:hyperlink r:id="rId22">
+      <w:hyperlink r:id="rId25">
         <w:r>
           <w:rPr>
             <w:color w:val="0563C1"/>
@@ -846,7 +1011,7 @@
       <w:r>
         <w:t xml:space="preserve">. </w:t>
       </w:r>
-      <w:hyperlink r:id="rId23">
+      <w:hyperlink r:id="rId26">
         <w:r>
           <w:rPr>
             <w:color w:val="0563C1"/>
@@ -898,7 +1063,7 @@
       <w:r>
         <w:t xml:space="preserve">. </w:t>
       </w:r>
-      <w:hyperlink r:id="rId24">
+      <w:hyperlink r:id="rId27">
         <w:r>
           <w:rPr>
             <w:color w:val="0563C1"/>
@@ -918,7 +1083,62 @@
           <w:i w:val="0"/>
           <w:sz w:val="20"/>
         </w:rPr>
-        <w:t>Nivel A · 75 puntos · técnicas útiles: TEM+DLS+zeta · licencia: conflicto</w:t>
+        <w:t>Nivel A · 75 puntos · técnicas útiles: TEM+DLS+zeta · licencia: amarillo</w:t>
+      </w:r>
+    </w:p>
+    <w:p>
+      <w:pPr>
+        <w:spacing w:after="0"/>
+        <w:ind w:left="720" w:hanging="720"/>
+      </w:pPr>
+      <w:r>
+        <w:t xml:space="preserve">Lai, X., Wang, S., Ding, C., Kostoulias, X., Brun, A. P. L., Hsu, H., Jiang, J., Wang, Y., Strugnell, R. A., Peleg, A. Y., &amp; Shen, H. (2026). Enhanced Antibacterial Properties of Lyotropic Liquid Crystalline Nanoparticles via Curvature Modulation. </w:t>
+      </w:r>
+      <w:r>
+        <w:rPr>
+          <w:i/>
+        </w:rPr>
+        <w:t>Advanced Science</w:t>
+      </w:r>
+      <w:r>
+        <w:t xml:space="preserve">, </w:t>
+      </w:r>
+      <w:r>
+        <w:rPr>
+          <w:i/>
+        </w:rPr>
+        <w:t>13</w:t>
+      </w:r>
+      <w:r>
+        <w:t>(55)</w:t>
+      </w:r>
+      <w:r>
+        <w:t>, e76516</w:t>
+      </w:r>
+      <w:r>
+        <w:t xml:space="preserve">. </w:t>
+      </w:r>
+      <w:hyperlink r:id="rId28">
+        <w:r>
+          <w:rPr>
+            <w:color w:val="0563C1"/>
+            <w:u w:val="single"/>
+          </w:rPr>
+          <w:t xml:space="preserve">https://doi.org/10.1002/advs.76516</w:t>
+        </w:r>
+      </w:hyperlink>
+    </w:p>
+    <w:p>
+      <w:pPr>
+        <w:spacing w:after="160"/>
+        <w:ind w:left="720"/>
+      </w:pPr>
+      <w:r>
+        <w:rPr>
+          <w:i w:val="0"/>
+          <w:sz w:val="20"/>
+        </w:rPr>
+        <w:t>Nivel A · 75 puntos · técnicas útiles: cryo+DLS+zeta · licencia: verde</w:t>
       </w:r>
     </w:p>
     <w:p>
@@ -950,7 +1170,7 @@
       <w:r>
         <w:t xml:space="preserve">. </w:t>
       </w:r>
-      <w:hyperlink r:id="rId25">
+      <w:hyperlink r:id="rId29">
         <w:r>
           <w:rPr>
             <w:color w:val="0563C1"/>
@@ -1013,7 +1233,7 @@
       <w:r>
         <w:t xml:space="preserve">. </w:t>
       </w:r>
-      <w:hyperlink r:id="rId26">
+      <w:hyperlink r:id="rId30">
         <w:r>
           <w:rPr>
             <w:color w:val="0563C1"/>
@@ -1068,7 +1288,7 @@
       <w:r>
         <w:t xml:space="preserve">. </w:t>
       </w:r>
-      <w:hyperlink r:id="rId27">
+      <w:hyperlink r:id="rId31">
         <w:r>
           <w:rPr>
             <w:color w:val="0563C1"/>
@@ -1088,7 +1308,7 @@
           <w:i w:val="0"/>
           <w:sz w:val="20"/>
         </w:rPr>
-        <w:t>Nivel A · 83 puntos · técnicas útiles: SEM+DLS+zeta+FTIR · licencia: conflicto</w:t>
+        <w:t>Nivel A · 83 puntos · técnicas útiles: SEM+DLS+zeta+FTIR · licencia: amarillo</w:t>
       </w:r>
     </w:p>
     <w:p>
@@ -1123,7 +1343,7 @@
       <w:r>
         <w:t xml:space="preserve">. </w:t>
       </w:r>
-      <w:hyperlink r:id="rId28">
+      <w:hyperlink r:id="rId32">
         <w:r>
           <w:rPr>
             <w:color w:val="0563C1"/>
@@ -1143,7 +1363,7 @@
           <w:i w:val="0"/>
           <w:sz w:val="20"/>
         </w:rPr>
-        <w:t>Nivel A · 83 puntos · técnicas útiles: TEM+DLS+zeta+FTIR · licencia: conflicto</w:t>
+        <w:t>Nivel A · 83 puntos · técnicas útiles: TEM+DLS+zeta+FTIR · licencia: amarillo</w:t>
       </w:r>
     </w:p>
     <w:p>
@@ -1178,7 +1398,7 @@
       <w:r>
         <w:t xml:space="preserve">. </w:t>
       </w:r>
-      <w:hyperlink r:id="rId29">
+      <w:hyperlink r:id="rId33">
         <w:r>
           <w:rPr>
             <w:color w:val="0563C1"/>
@@ -1233,7 +1453,7 @@
       <w:r>
         <w:t xml:space="preserve">. </w:t>
       </w:r>
-      <w:hyperlink r:id="rId30">
+      <w:hyperlink r:id="rId34">
         <w:r>
           <w:rPr>
             <w:color w:val="0563C1"/>
@@ -1288,7 +1508,7 @@
       <w:r>
         <w:t xml:space="preserve">. </w:t>
       </w:r>
-      <w:hyperlink r:id="rId31">
+      <w:hyperlink r:id="rId35">
         <w:r>
           <w:rPr>
             <w:color w:val="0563C1"/>
@@ -1308,7 +1528,7 @@
           <w:i w:val="0"/>
           <w:sz w:val="20"/>
         </w:rPr>
-        <w:t>Nivel A · 80 puntos · técnicas útiles: TEM+DLS+zeta · licencia: conflicto</w:t>
+        <w:t>Nivel A · 80 puntos · técnicas útiles: TEM+DLS+zeta · licencia: amarillo</w:t>
       </w:r>
     </w:p>
     <w:p>
@@ -1343,7 +1563,7 @@
       <w:r>
         <w:t xml:space="preserve">. </w:t>
       </w:r>
-      <w:hyperlink r:id="rId32">
+      <w:hyperlink r:id="rId36">
         <w:r>
           <w:rPr>
             <w:color w:val="0563C1"/>
@@ -1363,7 +1583,7 @@
           <w:i w:val="0"/>
           <w:sz w:val="20"/>
         </w:rPr>
-        <w:t>Nivel A · 80 puntos · técnicas útiles: SEM+DLS+zeta · licencia: conflicto</w:t>
+        <w:t>Nivel A · 80 puntos · técnicas útiles: SEM+DLS+zeta · licencia: amarillo</w:t>
       </w:r>
     </w:p>
     <w:p>
@@ -1398,7 +1618,7 @@
       <w:r>
         <w:t xml:space="preserve">. </w:t>
       </w:r>
-      <w:hyperlink r:id="rId33">
+      <w:hyperlink r:id="rId37">
         <w:r>
           <w:rPr>
             <w:color w:val="0563C1"/>
@@ -1418,7 +1638,7 @@
           <w:i w:val="0"/>
           <w:sz w:val="20"/>
         </w:rPr>
-        <w:t>Nivel A · 80 puntos · técnicas útiles: TEM+DLS+zeta · licencia: conflicto</w:t>
+        <w:t>Nivel A · 80 puntos · técnicas útiles: TEM+DLS+zeta · licencia: amarillo</w:t>
       </w:r>
     </w:p>
     <w:p>
@@ -1453,7 +1673,7 @@
       <w:r>
         <w:t xml:space="preserve">. </w:t>
       </w:r>
-      <w:hyperlink r:id="rId34">
+      <w:hyperlink r:id="rId38">
         <w:r>
           <w:rPr>
             <w:color w:val="0563C1"/>
@@ -1473,7 +1693,62 @@
           <w:i w:val="0"/>
           <w:sz w:val="20"/>
         </w:rPr>
-        <w:t>Nivel A · 80 puntos · técnicas útiles: TEM+DLS+zeta · licencia: conflicto</w:t>
+        <w:t>Nivel A · 80 puntos · técnicas útiles: TEM+DLS+zeta · licencia: amarillo</w:t>
+      </w:r>
+    </w:p>
+    <w:p>
+      <w:pPr>
+        <w:spacing w:after="0"/>
+        <w:ind w:left="720" w:hanging="720"/>
+      </w:pPr>
+      <w:r>
+        <w:t xml:space="preserve">Shishlyannikov, S. M., Zubkov, I. N., Vysochinskaya, V. V., Gavrilova, N. V., Dobrovolskaya, O. A., Elpaeva, E. A., Maslov, M. A., &amp; Vasin, A. (2024). Stable Polymer-Lipid Hybrid Nanoparticles Based on mcl-Polyhydroxyalkanoate and Cationic Liposomes for mRNA Delivery. </w:t>
+      </w:r>
+      <w:r>
+        <w:rPr>
+          <w:i/>
+        </w:rPr>
+        <w:t>Pharmaceutics</w:t>
+      </w:r>
+      <w:r>
+        <w:t xml:space="preserve">, </w:t>
+      </w:r>
+      <w:r>
+        <w:rPr>
+          <w:i/>
+        </w:rPr>
+        <w:t>16</w:t>
+      </w:r>
+      <w:r>
+        <w:t>(10)</w:t>
+      </w:r>
+      <w:r>
+        <w:t>, 1305</w:t>
+      </w:r>
+      <w:r>
+        <w:t xml:space="preserve">. </w:t>
+      </w:r>
+      <w:hyperlink r:id="rId39">
+        <w:r>
+          <w:rPr>
+            <w:color w:val="0563C1"/>
+            <w:u w:val="single"/>
+          </w:rPr>
+          <w:t xml:space="preserve">https://doi.org/10.3390/pharmaceutics16101305</w:t>
+        </w:r>
+      </w:hyperlink>
+    </w:p>
+    <w:p>
+      <w:pPr>
+        <w:spacing w:after="160"/>
+        <w:ind w:left="720"/>
+      </w:pPr>
+      <w:r>
+        <w:rPr>
+          <w:i w:val="0"/>
+          <w:sz w:val="20"/>
+        </w:rPr>
+        <w:t>Nivel A · 80 puntos · técnicas útiles: TEM+DLS+zeta · licencia: verde</w:t>
       </w:r>
     </w:p>
     <w:p>
@@ -1496,7 +1771,7 @@
       <w:r>
         <w:t xml:space="preserve">. </w:t>
       </w:r>
-      <w:hyperlink r:id="rId35">
+      <w:hyperlink r:id="rId40">
         <w:r>
           <w:rPr>
             <w:color w:val="0563C1"/>
@@ -1516,7 +1791,7 @@
           <w:i w:val="0"/>
           <w:sz w:val="20"/>
         </w:rPr>
-        <w:t>Nivel A · 75 puntos · técnicas útiles: TEM+DLS+zeta · licencia: conflicto</w:t>
+        <w:t>Nivel A · 75 puntos · técnicas útiles: TEM+DLS+zeta · licencia: amarillo</w:t>
       </w:r>
     </w:p>
     <w:p>
@@ -1548,7 +1823,7 @@
       <w:r>
         <w:t xml:space="preserve">. </w:t>
       </w:r>
-      <w:hyperlink r:id="rId36">
+      <w:hyperlink r:id="rId41">
         <w:r>
           <w:rPr>
             <w:color w:val="0563C1"/>
@@ -1603,7 +1878,7 @@
       <w:r>
         <w:t xml:space="preserve">. </w:t>
       </w:r>
-      <w:hyperlink r:id="rId37">
+      <w:hyperlink r:id="rId42">
         <w:r>
           <w:rPr>
             <w:color w:val="0563C1"/>
@@ -1666,7 +1941,7 @@
       <w:r>
         <w:t xml:space="preserve">. </w:t>
       </w:r>
-      <w:hyperlink r:id="rId38">
+      <w:hyperlink r:id="rId43">
         <w:r>
           <w:rPr>
             <w:color w:val="0563C1"/>
@@ -1721,7 +1996,7 @@
       <w:r>
         <w:t xml:space="preserve">. </w:t>
       </w:r>
-      <w:hyperlink r:id="rId39">
+      <w:hyperlink r:id="rId44">
         <w:r>
           <w:rPr>
             <w:color w:val="0563C1"/>
@@ -1776,7 +2051,7 @@
       <w:r>
         <w:t xml:space="preserve">. </w:t>
       </w:r>
-      <w:hyperlink r:id="rId40">
+      <w:hyperlink r:id="rId45">
         <w:r>
           <w:rPr>
             <w:color w:val="0563C1"/>
@@ -1831,7 +2106,7 @@
       <w:r>
         <w:t xml:space="preserve">. </w:t>
       </w:r>
-      <w:hyperlink r:id="rId41">
+      <w:hyperlink r:id="rId46">
         <w:r>
           <w:rPr>
             <w:color w:val="0563C1"/>
@@ -1886,7 +2161,7 @@
       <w:r>
         <w:t xml:space="preserve">. </w:t>
       </w:r>
-      <w:hyperlink r:id="rId42">
+      <w:hyperlink r:id="rId47">
         <w:r>
           <w:rPr>
             <w:color w:val="0563C1"/>
@@ -1906,7 +2181,7 @@
           <w:i w:val="0"/>
           <w:sz w:val="20"/>
         </w:rPr>
-        <w:t>Nivel A · 80 puntos · técnicas útiles: TEM+DLS+zeta · licencia: conflicto</w:t>
+        <w:t>Nivel A · 80 puntos · técnicas útiles: TEM+DLS+zeta · licencia: amarillo</w:t>
       </w:r>
     </w:p>
     <w:p>
@@ -1941,7 +2216,7 @@
       <w:r>
         <w:t xml:space="preserve">. </w:t>
       </w:r>
-      <w:hyperlink r:id="rId43">
+      <w:hyperlink r:id="rId48">
         <w:r>
           <w:rPr>
             <w:color w:val="0563C1"/>
@@ -1970,13 +2245,13 @@
         <w:ind w:left="720" w:hanging="720"/>
       </w:pPr>
       <w:r>
-        <w:t xml:space="preserve">Li, M., Fang, G., Zahid, F., Saleem, R., Ishrat, G., Ali, Z., Naeem, M., &amp; Din, F. u. (2024). RETRACTED: Co-delivery of paclitaxel and curcumin loaded solid lipid nanoparticles for improved targeting of lung cancer: In vitro and in vivo investigation. </w:t>
+        <w:t xml:space="preserve">Elmowafy, M., Ibrahim, H. M., Ahmed, M. A., Shalaby, K., Salama, A., &amp; Hefesha, H. (2017). Atorvastatin-loaded nanostructured lipid carriers (NLCs): strategy to overcome oral delivery drawbacks. </w:t>
       </w:r>
       <w:r>
         <w:rPr>
           <w:i/>
         </w:rPr>
-        <w:t>Heliyon</w:t>
+        <w:t>Drug Delivery</w:t>
       </w:r>
       <w:r>
         <w:t xml:space="preserve">, </w:t>
@@ -1985,24 +2260,24 @@
         <w:rPr>
           <w:i/>
         </w:rPr>
-        <w:t>10</w:t>
-      </w:r>
-      <w:r>
-        <w:t>(9)</w:t>
-      </w:r>
-      <w:r>
-        <w:t>, e30290</w:t>
+        <w:t>24</w:t>
+      </w:r>
+      <w:r>
+        <w:t>(1)</w:t>
+      </w:r>
+      <w:r>
+        <w:t>, 932-941</w:t>
       </w:r>
       <w:r>
         <w:t xml:space="preserve">. </w:t>
       </w:r>
-      <w:hyperlink r:id="rId44">
+      <w:hyperlink r:id="rId49">
         <w:r>
           <w:rPr>
             <w:color w:val="0563C1"/>
             <w:u w:val="single"/>
           </w:rPr>
-          <w:t xml:space="preserve">https://doi.org/10.1016/j.heliyon.2024.e30290</w:t>
+          <w:t xml:space="preserve">https://doi.org/10.1080/10717544.2017.1337823</w:t>
         </w:r>
       </w:hyperlink>
     </w:p>
@@ -2016,7 +2291,114 @@
           <w:i w:val="0"/>
           <w:sz w:val="20"/>
         </w:rPr>
-        <w:t>Nivel A · 79 puntos · técnicas útiles: TEM+DLS+zeta+XRD+DSC · licencia: conflicto</w:t>
+        <w:t>Nivel A · 80 puntos · técnicas útiles: TEM+DLS+zeta · licencia: verde</w:t>
+      </w:r>
+    </w:p>
+    <w:p>
+      <w:pPr>
+        <w:spacing w:after="0"/>
+        <w:ind w:left="720" w:hanging="720"/>
+      </w:pPr>
+      <w:r>
+        <w:t xml:space="preserve">Carbone, C., Caddeo, C., Grimaudo, M. A., Manno, D. E., Serra, A., &amp; Musumeci, T. (2020). Ferulic Acid-NLC with Lavandula Essential Oil: A Possible Strategy for Wound-Healing?. </w:t>
+      </w:r>
+      <w:r>
+        <w:rPr>
+          <w:i/>
+        </w:rPr>
+        <w:t>Nanomaterials</w:t>
+      </w:r>
+      <w:r>
+        <w:t xml:space="preserve">, </w:t>
+      </w:r>
+      <w:r>
+        <w:rPr>
+          <w:i/>
+        </w:rPr>
+        <w:t>10</w:t>
+      </w:r>
+      <w:r>
+        <w:t>(5)</w:t>
+      </w:r>
+      <w:r>
+        <w:t>, 898</w:t>
+      </w:r>
+      <w:r>
+        <w:t xml:space="preserve">. </w:t>
+      </w:r>
+      <w:hyperlink r:id="rId50">
+        <w:r>
+          <w:rPr>
+            <w:color w:val="0563C1"/>
+            <w:u w:val="single"/>
+          </w:rPr>
+          <w:t xml:space="preserve">https://doi.org/10.3390/nano10050898</w:t>
+        </w:r>
+      </w:hyperlink>
+    </w:p>
+    <w:p>
+      <w:pPr>
+        <w:spacing w:after="160"/>
+        <w:ind w:left="720"/>
+      </w:pPr>
+      <w:r>
+        <w:rPr>
+          <w:i w:val="0"/>
+          <w:sz w:val="20"/>
+        </w:rPr>
+        <w:t>Nivel A · 80 puntos · técnicas útiles: cryo+DLS+zeta · licencia: verde</w:t>
+      </w:r>
+    </w:p>
+    <w:p>
+      <w:pPr>
+        <w:spacing w:after="0"/>
+        <w:ind w:left="720" w:hanging="720"/>
+      </w:pPr>
+      <w:r>
+        <w:t xml:space="preserve">Bhattacharya, S., &amp; Sharma, S. (2023). Dacarbazine-encapsulated solid lipid nanoparticles for skin cancer: physical characterization, stability, in-vivo activity, histopathology, and immunohistochemistry. </w:t>
+      </w:r>
+      <w:r>
+        <w:rPr>
+          <w:i/>
+        </w:rPr>
+        <w:t>Frontiers in Oncology</w:t>
+      </w:r>
+      <w:r>
+        <w:t xml:space="preserve">, </w:t>
+      </w:r>
+      <w:r>
+        <w:rPr>
+          <w:i/>
+        </w:rPr>
+        <w:t>13</w:t>
+      </w:r>
+      <w:r>
+        <w:t>, 1102269</w:t>
+      </w:r>
+      <w:r>
+        <w:t xml:space="preserve">. </w:t>
+      </w:r>
+      <w:hyperlink r:id="rId51">
+        <w:r>
+          <w:rPr>
+            <w:color w:val="0563C1"/>
+            <w:u w:val="single"/>
+          </w:rPr>
+          <w:t xml:space="preserve">https://doi.org/10.3389/fonc.2023.1102269</w:t>
+        </w:r>
+      </w:hyperlink>
+    </w:p>
+    <w:p>
+      <w:pPr>
+        <w:spacing w:after="160"/>
+        <w:ind w:left="720"/>
+      </w:pPr>
+      <w:r>
+        <w:rPr>
+          <w:i w:val="0"/>
+          <w:sz w:val="20"/>
+        </w:rPr>
+        <w:t>Nivel A · 80 puntos · técnicas útiles: TEM+DLS+zeta · licencia: verde</w:t>
       </w:r>
     </w:p>
     <w:p>
@@ -2051,7 +2433,7 @@
       <w:r>
         <w:t xml:space="preserve">. </w:t>
       </w:r>
-      <w:hyperlink r:id="rId45">
+      <w:hyperlink r:id="rId52">
         <w:r>
           <w:rPr>
             <w:color w:val="0563C1"/>
@@ -2080,6 +2462,61 @@
         <w:ind w:left="720" w:hanging="720"/>
       </w:pPr>
       <w:r>
+        <w:t xml:space="preserve">Wang, H., Li, L., Ye, J., Wang, R., Wang, R., Hu, J., Wang, Y., Dong, W., Xia, X., Yang, Y., Gao, Y., Gao, L., &amp; Liu, Y. (2020). Improving the Oral Bioavailability of an Anti-Glioma Prodrug CAT3 Using Novel Solid Lipid Nanoparticles Containing Oleic Acid-CAT3 Conjugates. </w:t>
+      </w:r>
+      <w:r>
+        <w:rPr>
+          <w:i/>
+        </w:rPr>
+        <w:t>Pharmaceutics</w:t>
+      </w:r>
+      <w:r>
+        <w:t xml:space="preserve">, </w:t>
+      </w:r>
+      <w:r>
+        <w:rPr>
+          <w:i/>
+        </w:rPr>
+        <w:t>12</w:t>
+      </w:r>
+      <w:r>
+        <w:t>(2)</w:t>
+      </w:r>
+      <w:r>
+        <w:t>, 126</w:t>
+      </w:r>
+      <w:r>
+        <w:t xml:space="preserve">. </w:t>
+      </w:r>
+      <w:hyperlink r:id="rId53">
+        <w:r>
+          <w:rPr>
+            <w:color w:val="0563C1"/>
+            <w:u w:val="single"/>
+          </w:rPr>
+          <w:t xml:space="preserve">https://doi.org/10.3390/pharmaceutics12020126</w:t>
+        </w:r>
+      </w:hyperlink>
+    </w:p>
+    <w:p>
+      <w:pPr>
+        <w:spacing w:after="160"/>
+        <w:ind w:left="720"/>
+      </w:pPr>
+      <w:r>
+        <w:rPr>
+          <w:i w:val="0"/>
+          <w:sz w:val="20"/>
+        </w:rPr>
+        <w:t>Nivel A · 75 puntos · técnicas útiles: TEM+DLS+zeta · licencia: verde</w:t>
+      </w:r>
+    </w:p>
+    <w:p>
+      <w:pPr>
+        <w:spacing w:after="0"/>
+        <w:ind w:left="720" w:hanging="720"/>
+      </w:pPr>
+      <w:r>
         <w:t xml:space="preserve">Ilyas, U., Asif, M., Wang, M., Altaf, R., Zafar, H., Faran Ashraf Baig, M. M., Paiva-Santos, A. C., &amp; Abbas, M. (2022). Nanostructured Lipid Carrier-Based Delivery of Pioglitazone for Treatment of Type 2 Diabetes. </w:t>
       </w:r>
       <w:r>
@@ -2103,7 +2540,7 @@
       <w:r>
         <w:t xml:space="preserve">. </w:t>
       </w:r>
-      <w:hyperlink r:id="rId46">
+      <w:hyperlink r:id="rId54">
         <w:r>
           <w:rPr>
             <w:color w:val="0563C1"/>
@@ -2158,7 +2595,7 @@
       <w:r>
         <w:t xml:space="preserve">. </w:t>
       </w:r>
-      <w:hyperlink r:id="rId47">
+      <w:hyperlink r:id="rId55">
         <w:r>
           <w:rPr>
             <w:color w:val="0563C1"/>
@@ -2183,6 +2620,61 @@
     </w:p>
     <w:p>
       <w:pPr>
+        <w:spacing w:after="0"/>
+        <w:ind w:left="720" w:hanging="720"/>
+      </w:pPr>
+      <w:r>
+        <w:t xml:space="preserve">Gu, Y., Yang, M., Tang, X., Wang, T., Yang, D., Zhai, G., &amp; Liu, J. (2018). Lipid nanoparticles loading triptolide for transdermal delivery: mechanisms of penetration enhancement and transport properties. </w:t>
+      </w:r>
+      <w:r>
+        <w:rPr>
+          <w:i/>
+        </w:rPr>
+        <w:t>Journal of Nanobiotechnology</w:t>
+      </w:r>
+      <w:r>
+        <w:t xml:space="preserve">, </w:t>
+      </w:r>
+      <w:r>
+        <w:rPr>
+          <w:i/>
+        </w:rPr>
+        <w:t>16</w:t>
+      </w:r>
+      <w:r>
+        <w:t>(1)</w:t>
+      </w:r>
+      <w:r>
+        <w:t>, 68</w:t>
+      </w:r>
+      <w:r>
+        <w:t xml:space="preserve">. </w:t>
+      </w:r>
+      <w:hyperlink r:id="rId56">
+        <w:r>
+          <w:rPr>
+            <w:color w:val="0563C1"/>
+            <w:u w:val="single"/>
+          </w:rPr>
+          <w:t xml:space="preserve">https://doi.org/10.1186/s12951-018-0389-3</w:t>
+        </w:r>
+      </w:hyperlink>
+    </w:p>
+    <w:p>
+      <w:pPr>
+        <w:spacing w:after="160"/>
+        <w:ind w:left="720"/>
+      </w:pPr>
+      <w:r>
+        <w:rPr>
+          <w:i w:val="0"/>
+          <w:sz w:val="20"/>
+        </w:rPr>
+        <w:t>Nivel A · 70 puntos · técnicas útiles: TEM+DLS+zeta · licencia: verde</w:t>
+      </w:r>
+    </w:p>
+    <w:p>
+      <w:pPr>
         <w:pStyle w:val="Heading3"/>
       </w:pPr>
       <w:r>
@@ -2221,7 +2713,7 @@
       <w:r>
         <w:t xml:space="preserve">. </w:t>
       </w:r>
-      <w:hyperlink r:id="rId48">
+      <w:hyperlink r:id="rId57">
         <w:r>
           <w:rPr>
             <w:color w:val="0563C1"/>
@@ -2276,7 +2768,7 @@
       <w:r>
         <w:t xml:space="preserve">. </w:t>
       </w:r>
-      <w:hyperlink r:id="rId49">
+      <w:hyperlink r:id="rId58">
         <w:r>
           <w:rPr>
             <w:color w:val="0563C1"/>
@@ -2301,6 +2793,61 @@
     </w:p>
     <w:p>
       <w:pPr>
+        <w:spacing w:after="0"/>
+        <w:ind w:left="720" w:hanging="720"/>
+      </w:pPr>
+      <w:r>
+        <w:t xml:space="preserve">Lara, G., Cipreste, M., Andrade, G., Silva, W., &amp; Sousa, E. (2018). Response of Fibroblasts MRC-5 to Flufenamic Acid-Grafted MCM-41 Nanoparticles. </w:t>
+      </w:r>
+      <w:r>
+        <w:rPr>
+          <w:i/>
+        </w:rPr>
+        <w:t>Bioengineering</w:t>
+      </w:r>
+      <w:r>
+        <w:t xml:space="preserve">, </w:t>
+      </w:r>
+      <w:r>
+        <w:rPr>
+          <w:i/>
+        </w:rPr>
+        <w:t>5</w:t>
+      </w:r>
+      <w:r>
+        <w:t>(1)</w:t>
+      </w:r>
+      <w:r>
+        <w:t>, 4</w:t>
+      </w:r>
+      <w:r>
+        <w:t xml:space="preserve">. </w:t>
+      </w:r>
+      <w:hyperlink r:id="rId59">
+        <w:r>
+          <w:rPr>
+            <w:color w:val="0563C1"/>
+            <w:u w:val="single"/>
+          </w:rPr>
+          <w:t xml:space="preserve">https://doi.org/10.3390/bioengineering5010004</w:t>
+        </w:r>
+      </w:hyperlink>
+    </w:p>
+    <w:p>
+      <w:pPr>
+        <w:spacing w:after="160"/>
+        <w:ind w:left="720"/>
+      </w:pPr>
+      <w:r>
+        <w:rPr>
+          <w:i w:val="0"/>
+          <w:sz w:val="20"/>
+        </w:rPr>
+        <w:t>Nivel A · 70 puntos · técnicas útiles: SEM+DLS+zeta · licencia: verde</w:t>
+      </w:r>
+    </w:p>
+    <w:p>
+      <w:pPr>
         <w:pStyle w:val="Heading3"/>
       </w:pPr>
       <w:r>
@@ -2339,7 +2886,7 @@
       <w:r>
         <w:t xml:space="preserve">. </w:t>
       </w:r>
-      <w:hyperlink r:id="rId50">
+      <w:hyperlink r:id="rId60">
         <w:r>
           <w:rPr>
             <w:color w:val="0563C1"/>
@@ -2394,7 +2941,7 @@
       <w:r>
         <w:t xml:space="preserve">. </w:t>
       </w:r>
-      <w:hyperlink r:id="rId51">
+      <w:hyperlink r:id="rId61">
         <w:r>
           <w:rPr>
             <w:color w:val="0563C1"/>
@@ -2414,7 +2961,62 @@
           <w:i w:val="0"/>
           <w:sz w:val="20"/>
         </w:rPr>
-        <w:t>Nivel A · 83 puntos · técnicas útiles: TEM+DLS+zeta+FTIR · licencia: conflicto</w:t>
+        <w:t>Nivel A · 83 puntos · técnicas útiles: TEM+DLS+zeta+FTIR · licencia: amarillo</w:t>
+      </w:r>
+    </w:p>
+    <w:p>
+      <w:pPr>
+        <w:spacing w:after="0"/>
+        <w:ind w:left="720" w:hanging="720"/>
+      </w:pPr>
+      <w:r>
+        <w:t xml:space="preserve">Santos, T. T., Lages, E. B., Ricotta, T. N. Q., de Oliveira, L. G., Ramos, G. S., Burlot, J., Abreu, S., Chaminade, P., Legrand, F. X., Tran, P., Deloménie, C., Vallejos, V. M. R., Helou, D. G., de Almeida, R. M., Queiroz-Junior, C. M., Teobaldo, G. B. M., de Oliveira, C. L. P., Ferreira, L. A. M., Aguiar, M. M. G., ... Frézard, F. (2025). Long-Circulating Liposomes Codelivering Amphotericin B and Retinoic Acid for Cutaneous Leishmaniasis Treatment. </w:t>
+      </w:r>
+      <w:r>
+        <w:rPr>
+          <w:i/>
+        </w:rPr>
+        <w:t>ACS Omega</w:t>
+      </w:r>
+      <w:r>
+        <w:t xml:space="preserve">, </w:t>
+      </w:r>
+      <w:r>
+        <w:rPr>
+          <w:i/>
+        </w:rPr>
+        <w:t>10</w:t>
+      </w:r>
+      <w:r>
+        <w:t>(41)</w:t>
+      </w:r>
+      <w:r>
+        <w:t>, 48514-48530</w:t>
+      </w:r>
+      <w:r>
+        <w:t xml:space="preserve">. </w:t>
+      </w:r>
+      <w:hyperlink r:id="rId62">
+        <w:r>
+          <w:rPr>
+            <w:color w:val="0563C1"/>
+            <w:u w:val="single"/>
+          </w:rPr>
+          <w:t xml:space="preserve">https://doi.org/10.1021/acsomega.5c06156</w:t>
+        </w:r>
+      </w:hyperlink>
+    </w:p>
+    <w:p>
+      <w:pPr>
+        <w:spacing w:after="160"/>
+        <w:ind w:left="720"/>
+      </w:pPr>
+      <w:r>
+        <w:rPr>
+          <w:i w:val="0"/>
+          <w:sz w:val="20"/>
+        </w:rPr>
+        <w:t>Nivel A · 82 puntos · técnicas útiles: cryo+DLS+zeta+UVVis · licencia: verde</w:t>
       </w:r>
     </w:p>
     <w:p>
@@ -2449,7 +3051,7 @@
       <w:r>
         <w:t xml:space="preserve">. </w:t>
       </w:r>
-      <w:hyperlink r:id="rId52">
+      <w:hyperlink r:id="rId63">
         <w:r>
           <w:rPr>
             <w:color w:val="0563C1"/>
@@ -2501,7 +3103,7 @@
       <w:r>
         <w:t xml:space="preserve">. </w:t>
       </w:r>
-      <w:hyperlink r:id="rId53">
+      <w:hyperlink r:id="rId64">
         <w:r>
           <w:rPr>
             <w:color w:val="0563C1"/>
@@ -2530,7 +3132,279 @@
         <w:ind w:left="720" w:hanging="720"/>
       </w:pPr>
       <w:r>
-        <w:t xml:space="preserve">Gkartziou, F., Plota, M., Kypraiou, C., Gauttam, I., Kolonitsiou, F., Klepetsanis, P., Spiliopoulou, I., &amp; Antimisiaris, S. G. (2024). Daptomycin Liposomes Exhibit Enhanced Activity against Staphylococci Biofilms Compared to Free Drug. </w:t>
+        <w:t xml:space="preserve">Peram, M., Patil, S., Suryadevara, V., Yarguntla, S., Kamalakar, S., Patil, P., Paravastu, K., Deshmukh, A. V., Kugaji, M., &amp; Nadaf, S. (2025). Phospholipid-Based Ultraflexible Nanovesicular Gel of Sertaconazole Nitrate for the Treatment of Skin Fungal Infections: Statistical Optimization, In Vitro and Preclinical Assessment. </w:t>
+      </w:r>
+      <w:r>
+        <w:rPr>
+          <w:i/>
+        </w:rPr>
+        <w:t>Gels</w:t>
+      </w:r>
+      <w:r>
+        <w:t xml:space="preserve">, </w:t>
+      </w:r>
+      <w:r>
+        <w:rPr>
+          <w:i/>
+        </w:rPr>
+        <w:t>11</w:t>
+      </w:r>
+      <w:r>
+        <w:t>(11)</w:t>
+      </w:r>
+      <w:r>
+        <w:t>, 909</w:t>
+      </w:r>
+      <w:r>
+        <w:t xml:space="preserve">. </w:t>
+      </w:r>
+      <w:hyperlink r:id="rId65">
+        <w:r>
+          <w:rPr>
+            <w:color w:val="0563C1"/>
+            <w:u w:val="single"/>
+          </w:rPr>
+          <w:t xml:space="preserve">https://doi.org/10.3390/gels11110909</w:t>
+        </w:r>
+      </w:hyperlink>
+    </w:p>
+    <w:p>
+      <w:pPr>
+        <w:spacing w:after="160"/>
+        <w:ind w:left="720"/>
+      </w:pPr>
+      <w:r>
+        <w:rPr>
+          <w:i w:val="0"/>
+          <w:sz w:val="20"/>
+        </w:rPr>
+        <w:t>Nivel A · 80 puntos · técnicas útiles: TEM+DLS+zeta · licencia: verde</w:t>
+      </w:r>
+    </w:p>
+    <w:p>
+      <w:pPr>
+        <w:spacing w:after="0"/>
+        <w:ind w:left="720" w:hanging="720"/>
+      </w:pPr>
+      <w:r>
+        <w:t xml:space="preserve">Farouk, A. E., Fahmy, S. R., Soliman, A. M., Ibrahim, S. A., &amp; Sadek, S. A. (2023). A nano-Liposomal formulation potentiates antioxidant, anti-inflammatory, and fibrinolytic activities of Allolobophora caliginosa coelomic fluid: formulation and characterization. </w:t>
+      </w:r>
+      <w:r>
+        <w:rPr>
+          <w:i/>
+        </w:rPr>
+        <w:t>BMC Biotechnology</w:t>
+      </w:r>
+      <w:r>
+        <w:t xml:space="preserve">, </w:t>
+      </w:r>
+      <w:r>
+        <w:rPr>
+          <w:i/>
+        </w:rPr>
+        <w:t>23</w:t>
+      </w:r>
+      <w:r>
+        <w:t>(1)</w:t>
+      </w:r>
+      <w:r>
+        <w:t>, 28</w:t>
+      </w:r>
+      <w:r>
+        <w:t xml:space="preserve">. </w:t>
+      </w:r>
+      <w:hyperlink r:id="rId66">
+        <w:r>
+          <w:rPr>
+            <w:color w:val="0563C1"/>
+            <w:u w:val="single"/>
+          </w:rPr>
+          <w:t xml:space="preserve">https://doi.org/10.1186/s12896-023-00795-5</w:t>
+        </w:r>
+      </w:hyperlink>
+    </w:p>
+    <w:p>
+      <w:pPr>
+        <w:spacing w:after="160"/>
+        <w:ind w:left="720"/>
+      </w:pPr>
+      <w:r>
+        <w:rPr>
+          <w:i w:val="0"/>
+          <w:sz w:val="20"/>
+        </w:rPr>
+        <w:t>Nivel A · 79 puntos · técnicas útiles: TEM+DLS+zeta+FTIR+XRD · licencia: verde</w:t>
+      </w:r>
+    </w:p>
+    <w:p>
+      <w:pPr>
+        <w:spacing w:after="0"/>
+        <w:ind w:left="720" w:hanging="720"/>
+      </w:pPr>
+      <w:r>
+        <w:t xml:space="preserve">Metkar, S. P., Fernandes, G., Nikam, A. N., Soman, S., Birangal, S., Seetharam, R. N., Joshi, M. B., &amp; Mutalik, S. (2023). Mannosylated-Chitosan-Coated Andrographolide Nanoliposomes for the Treatment of Hepatitis: In Vitro and In Vivo Evaluations. </w:t>
+      </w:r>
+      <w:r>
+        <w:rPr>
+          <w:i/>
+        </w:rPr>
+        <w:t>Membranes</w:t>
+      </w:r>
+      <w:r>
+        <w:t xml:space="preserve">, </w:t>
+      </w:r>
+      <w:r>
+        <w:rPr>
+          <w:i/>
+        </w:rPr>
+        <w:t>13</w:t>
+      </w:r>
+      <w:r>
+        <w:t>(2)</w:t>
+      </w:r>
+      <w:r>
+        <w:t>, 193</w:t>
+      </w:r>
+      <w:r>
+        <w:t xml:space="preserve">. </w:t>
+      </w:r>
+      <w:hyperlink r:id="rId67">
+        <w:r>
+          <w:rPr>
+            <w:color w:val="0563C1"/>
+            <w:u w:val="single"/>
+          </w:rPr>
+          <w:t xml:space="preserve">https://doi.org/10.3390/membranes13020193</w:t>
+        </w:r>
+      </w:hyperlink>
+    </w:p>
+    <w:p>
+      <w:pPr>
+        <w:spacing w:after="160"/>
+        <w:ind w:left="720"/>
+      </w:pPr>
+      <w:r>
+        <w:rPr>
+          <w:i w:val="0"/>
+          <w:sz w:val="20"/>
+        </w:rPr>
+        <w:t>Nivel A · 77 puntos · técnicas útiles: TEM+DLS+zeta+FTIR+XRD · licencia: verde</w:t>
+      </w:r>
+    </w:p>
+    <w:p>
+      <w:pPr>
+        <w:spacing w:after="0"/>
+        <w:ind w:left="720" w:hanging="720"/>
+      </w:pPr>
+      <w:r>
+        <w:t xml:space="preserve">Pei, Z., Xu, H., Zhao, P., Wen, Y., Zhang, Z., Huang, L., Wang, M., Peng, B., Wen, L., Wen, P., &amp; Sun, F. (2026). Reconstructing the ischemic osteogenic microenvironment through hierarchical scaffolds orchestrating Mg2+ signaling and neuropilin-1–mediated angiogenesis. </w:t>
+      </w:r>
+      <w:r>
+        <w:rPr>
+          <w:i/>
+        </w:rPr>
+        <w:t>Bioactive Materials</w:t>
+      </w:r>
+      <w:r>
+        <w:t xml:space="preserve">, </w:t>
+      </w:r>
+      <w:r>
+        <w:rPr>
+          <w:i/>
+        </w:rPr>
+        <w:t>62</w:t>
+      </w:r>
+      <w:r>
+        <w:t>, 738-758</w:t>
+      </w:r>
+      <w:r>
+        <w:t xml:space="preserve">. </w:t>
+      </w:r>
+      <w:hyperlink r:id="rId68">
+        <w:r>
+          <w:rPr>
+            <w:color w:val="0563C1"/>
+            <w:u w:val="single"/>
+          </w:rPr>
+          <w:t xml:space="preserve">https://doi.org/10.1016/j.bioactmat.2026.02.031</w:t>
+        </w:r>
+      </w:hyperlink>
+    </w:p>
+    <w:p>
+      <w:pPr>
+        <w:spacing w:after="160"/>
+        <w:ind w:left="720"/>
+      </w:pPr>
+      <w:r>
+        <w:rPr>
+          <w:i w:val="0"/>
+          <w:sz w:val="20"/>
+        </w:rPr>
+        <w:t>Nivel A · 75 puntos · técnicas útiles: SEM+DLS+zeta · licencia: verde</w:t>
+      </w:r>
+    </w:p>
+    <w:p>
+      <w:pPr>
+        <w:spacing w:after="0"/>
+        <w:ind w:left="720" w:hanging="720"/>
+      </w:pPr>
+      <w:r>
+        <w:t xml:space="preserve">De Luca, M., Tuberoso, C. I. G., Pons, R., García, M. T., Morán, M. d. C., Martelli, G., Vassallo, A., &amp; Caddeo, C. (2023). Ceratonia siliqua L. Pod Extract: From Phytochemical Characterization to Liposomal Formulation and Evaluation of Behaviour in Cells. </w:t>
+      </w:r>
+      <w:r>
+        <w:rPr>
+          <w:i/>
+        </w:rPr>
+        <w:t>Antioxidants</w:t>
+      </w:r>
+      <w:r>
+        <w:t xml:space="preserve">, </w:t>
+      </w:r>
+      <w:r>
+        <w:rPr>
+          <w:i/>
+        </w:rPr>
+        <w:t>12</w:t>
+      </w:r>
+      <w:r>
+        <w:t>(6)</w:t>
+      </w:r>
+      <w:r>
+        <w:t>, 1209</w:t>
+      </w:r>
+      <w:r>
+        <w:t xml:space="preserve">. </w:t>
+      </w:r>
+      <w:hyperlink r:id="rId69">
+        <w:r>
+          <w:rPr>
+            <w:color w:val="0563C1"/>
+            <w:u w:val="single"/>
+          </w:rPr>
+          <w:t xml:space="preserve">https://doi.org/10.3390/antiox12061209</w:t>
+        </w:r>
+      </w:hyperlink>
+    </w:p>
+    <w:p>
+      <w:pPr>
+        <w:spacing w:after="160"/>
+        <w:ind w:left="720"/>
+      </w:pPr>
+      <w:r>
+        <w:rPr>
+          <w:i w:val="0"/>
+          <w:sz w:val="20"/>
+        </w:rPr>
+        <w:t>Nivel A · 75 puntos · técnicas útiles: cryo+DLS+zeta · licencia: verde</w:t>
+      </w:r>
+    </w:p>
+    <w:p>
+      <w:pPr>
+        <w:spacing w:after="0"/>
+        <w:ind w:left="720" w:hanging="720"/>
+      </w:pPr>
+      <w:r>
+        <w:t xml:space="preserve">Peletta, A., Prompetchara, E., Tharakhet, K., Kaewpang, P., Buranapraditkun, S., Yostrerat, N., Manopwisedjaroen, S., Thitithanyanont, A., Avaro, J., Krupnik, L., Neels, A., Ruxrungtham, K., Ketloy, C., &amp; Borchard, G. (2022). Translating a Thin-Film Rehydration Method to Microfluidics for the Preparation of a SARS-CoV-2 DNA Vaccine: When Manufacturing Method Matters. </w:t>
       </w:r>
       <w:r>
         <w:rPr>
@@ -2545,6 +3419,61 @@
         <w:rPr>
           <w:i/>
         </w:rPr>
+        <w:t>14</w:t>
+      </w:r>
+      <w:r>
+        <w:t>(7)</w:t>
+      </w:r>
+      <w:r>
+        <w:t>, 1427</w:t>
+      </w:r>
+      <w:r>
+        <w:t xml:space="preserve">. </w:t>
+      </w:r>
+      <w:hyperlink r:id="rId70">
+        <w:r>
+          <w:rPr>
+            <w:color w:val="0563C1"/>
+            <w:u w:val="single"/>
+          </w:rPr>
+          <w:t xml:space="preserve">https://doi.org/10.3390/pharmaceutics14071427</w:t>
+        </w:r>
+      </w:hyperlink>
+    </w:p>
+    <w:p>
+      <w:pPr>
+        <w:spacing w:after="160"/>
+        <w:ind w:left="720"/>
+      </w:pPr>
+      <w:r>
+        <w:rPr>
+          <w:i w:val="0"/>
+          <w:sz w:val="20"/>
+        </w:rPr>
+        <w:t>Nivel A · 75 puntos · técnicas útiles: TEM+DLS+zeta · licencia: verde</w:t>
+      </w:r>
+    </w:p>
+    <w:p>
+      <w:pPr>
+        <w:spacing w:after="0"/>
+        <w:ind w:left="720" w:hanging="720"/>
+      </w:pPr>
+      <w:r>
+        <w:t xml:space="preserve">Gkartziou, F., Plota, M., Kypraiou, C., Gauttam, I., Kolonitsiou, F., Klepetsanis, P., Spiliopoulou, I., &amp; Antimisiaris, S. G. (2024). Daptomycin Liposomes Exhibit Enhanced Activity against Staphylococci Biofilms Compared to Free Drug. </w:t>
+      </w:r>
+      <w:r>
+        <w:rPr>
+          <w:i/>
+        </w:rPr>
+        <w:t>Pharmaceutics</w:t>
+      </w:r>
+      <w:r>
+        <w:t xml:space="preserve">, </w:t>
+      </w:r>
+      <w:r>
+        <w:rPr>
+          <w:i/>
+        </w:rPr>
         <w:t>16</w:t>
       </w:r>
       <w:r>
@@ -2556,7 +3485,7 @@
       <w:r>
         <w:t xml:space="preserve">. </w:t>
       </w:r>
-      <w:hyperlink r:id="rId54">
+      <w:hyperlink r:id="rId71">
         <w:r>
           <w:rPr>
             <w:color w:val="0563C1"/>
@@ -2611,7 +3540,7 @@
       <w:r>
         <w:t xml:space="preserve">. </w:t>
       </w:r>
-      <w:hyperlink r:id="rId55">
+      <w:hyperlink r:id="rId72">
         <w:r>
           <w:rPr>
             <w:color w:val="0563C1"/>
@@ -2666,7 +3595,7 @@
       <w:r>
         <w:t xml:space="preserve">. </w:t>
       </w:r>
-      <w:hyperlink r:id="rId56">
+      <w:hyperlink r:id="rId73">
         <w:r>
           <w:rPr>
             <w:color w:val="0563C1"/>
@@ -2686,7 +3615,7 @@
           <w:i w:val="0"/>
           <w:sz w:val="20"/>
         </w:rPr>
-        <w:t>Nivel A · 70 puntos · técnicas útiles: SEM+DLS+zeta · licencia: conflicto</w:t>
+        <w:t>Nivel A · 70 puntos · técnicas útiles: SEM+DLS+zeta · licencia: amarillo</w:t>
       </w:r>
     </w:p>
     <w:p>
@@ -2729,7 +3658,7 @@
       <w:r>
         <w:t xml:space="preserve">. </w:t>
       </w:r>
-      <w:hyperlink r:id="rId57">
+      <w:hyperlink r:id="rId74">
         <w:r>
           <w:rPr>
             <w:color w:val="0563C1"/>
@@ -2784,7 +3713,7 @@
       <w:r>
         <w:t xml:space="preserve">. </w:t>
       </w:r>
-      <w:hyperlink r:id="rId58">
+      <w:hyperlink r:id="rId75">
         <w:r>
           <w:rPr>
             <w:color w:val="0563C1"/>
@@ -2839,7 +3768,7 @@
       <w:r>
         <w:t xml:space="preserve">. </w:t>
       </w:r>
-      <w:hyperlink r:id="rId59">
+      <w:hyperlink r:id="rId76">
         <w:r>
           <w:rPr>
             <w:color w:val="0563C1"/>
@@ -2859,7 +3788,7 @@
           <w:i w:val="0"/>
           <w:sz w:val="20"/>
         </w:rPr>
-        <w:t>Nivel A · 80 puntos · técnicas útiles: TEM+DLS+zeta · licencia: conflicto</w:t>
+        <w:t>Nivel A · 80 puntos · técnicas útiles: TEM+DLS+zeta · licencia: amarillo</w:t>
       </w:r>
     </w:p>
     <w:p>
@@ -2894,7 +3823,7 @@
       <w:r>
         <w:t xml:space="preserve">. </w:t>
       </w:r>
-      <w:hyperlink r:id="rId60">
+      <w:hyperlink r:id="rId77">
         <w:r>
           <w:rPr>
             <w:color w:val="0563C1"/>
@@ -2949,7 +3878,7 @@
       <w:r>
         <w:t xml:space="preserve">. </w:t>
       </w:r>
-      <w:hyperlink r:id="rId61">
+      <w:hyperlink r:id="rId78">
         <w:r>
           <w:rPr>
             <w:color w:val="0563C1"/>
@@ -2978,7 +3907,7 @@
         <w:ind w:left="720" w:hanging="720"/>
       </w:pPr>
       <w:r>
-        <w:t xml:space="preserve">Ziebarth, J., da Silva, L. M., Lorenzett, A. K. P., Figueiredo, I. D., Carlstrom, P. F., Cardoso, F. N., de Freitas, A. L. F., Baviera, A. M., &amp; Mainardes, R. M. (2024). Oral Delivery of Liraglutide-Loaded Zein/Eudragit-Chitosan Nanoparticles Provides Pharmacokinetic and Glycemic Outcomes Comparable to Its Subcutaneous Injection in Rats. </w:t>
+        <w:t xml:space="preserve">Silva-Abreu, M., Miralles, E., Kamma-Lorger, C. S., Espina, M., García, M. L., &amp; Calpena, A. C. (2021). Stabilization by Nano Spray Dryer of Pioglitazone Polymeric Nanosystems: Development, In Vivo, Ex Vivo and Synchrotron Analysis. </w:t>
       </w:r>
       <w:r>
         <w:rPr>
@@ -2993,6 +3922,61 @@
         <w:rPr>
           <w:i/>
         </w:rPr>
+        <w:t>13</w:t>
+      </w:r>
+      <w:r>
+        <w:t>(11)</w:t>
+      </w:r>
+      <w:r>
+        <w:t>, 1751</w:t>
+      </w:r>
+      <w:r>
+        <w:t xml:space="preserve">. </w:t>
+      </w:r>
+      <w:hyperlink r:id="rId79">
+        <w:r>
+          <w:rPr>
+            <w:color w:val="0563C1"/>
+            <w:u w:val="single"/>
+          </w:rPr>
+          <w:t xml:space="preserve">https://doi.org/10.3390/pharmaceutics13111751</w:t>
+        </w:r>
+      </w:hyperlink>
+    </w:p>
+    <w:p>
+      <w:pPr>
+        <w:spacing w:after="160"/>
+        <w:ind w:left="720"/>
+      </w:pPr>
+      <w:r>
+        <w:rPr>
+          <w:i w:val="0"/>
+          <w:sz w:val="20"/>
+        </w:rPr>
+        <w:t>Nivel A · 76 puntos · técnicas útiles: TEM+DLS+zeta+DSC · licencia: verde</w:t>
+      </w:r>
+    </w:p>
+    <w:p>
+      <w:pPr>
+        <w:spacing w:after="0"/>
+        <w:ind w:left="720" w:hanging="720"/>
+      </w:pPr>
+      <w:r>
+        <w:t xml:space="preserve">Ziebarth, J., da Silva, L. M., Lorenzett, A. K. P., Figueiredo, I. D., Carlstrom, P. F., Cardoso, F. N., de Freitas, A. L. F., Baviera, A. M., &amp; Mainardes, R. M. (2024). Oral Delivery of Liraglutide-Loaded Zein/Eudragit-Chitosan Nanoparticles Provides Pharmacokinetic and Glycemic Outcomes Comparable to Its Subcutaneous Injection in Rats. </w:t>
+      </w:r>
+      <w:r>
+        <w:rPr>
+          <w:i/>
+        </w:rPr>
+        <w:t>Pharmaceutics</w:t>
+      </w:r>
+      <w:r>
+        <w:t xml:space="preserve">, </w:t>
+      </w:r>
+      <w:r>
+        <w:rPr>
+          <w:i/>
+        </w:rPr>
         <w:t>16</w:t>
       </w:r>
       <w:r>
@@ -3004,7 +3988,7 @@
       <w:r>
         <w:t xml:space="preserve">. </w:t>
       </w:r>
-      <w:hyperlink r:id="rId62">
+      <w:hyperlink r:id="rId80">
         <w:r>
           <w:rPr>
             <w:color w:val="0563C1"/>
@@ -3059,7 +4043,7 @@
       <w:r>
         <w:t xml:space="preserve">. </w:t>
       </w:r>
-      <w:hyperlink r:id="rId63">
+      <w:hyperlink r:id="rId81">
         <w:r>
           <w:rPr>
             <w:color w:val="0563C1"/>
@@ -3114,7 +4098,7 @@
       <w:r>
         <w:t xml:space="preserve">. </w:t>
       </w:r>
-      <w:hyperlink r:id="rId64">
+      <w:hyperlink r:id="rId82">
         <w:r>
           <w:rPr>
             <w:color w:val="0563C1"/>
@@ -3139,6 +4123,61 @@
     </w:p>
     <w:p>
       <w:pPr>
+        <w:spacing w:after="0"/>
+        <w:ind w:left="720" w:hanging="720"/>
+      </w:pPr>
+      <w:r>
+        <w:t xml:space="preserve">Badran, M. M., Alanazi, A. E., Ibrahim, M. A., Alshora, D. H., Taha, E., &amp; H. Alomrani, A. (2023). Optimization of Bromocriptine-Mesylate-Loaded Polycaprolactone Nanoparticles Coated with Chitosan for Nose-to-Brain Delivery: In Vitro and In Vivo Studies. </w:t>
+      </w:r>
+      <w:r>
+        <w:rPr>
+          <w:i/>
+        </w:rPr>
+        <w:t>Polymers</w:t>
+      </w:r>
+      <w:r>
+        <w:t xml:space="preserve">, </w:t>
+      </w:r>
+      <w:r>
+        <w:rPr>
+          <w:i/>
+        </w:rPr>
+        <w:t>15</w:t>
+      </w:r>
+      <w:r>
+        <w:t>(19)</w:t>
+      </w:r>
+      <w:r>
+        <w:t>, 3890</w:t>
+      </w:r>
+      <w:r>
+        <w:t xml:space="preserve">. </w:t>
+      </w:r>
+      <w:hyperlink r:id="rId83">
+        <w:r>
+          <w:rPr>
+            <w:color w:val="0563C1"/>
+            <w:u w:val="single"/>
+          </w:rPr>
+          <w:t xml:space="preserve">https://doi.org/10.3390/polym15193890</w:t>
+        </w:r>
+      </w:hyperlink>
+    </w:p>
+    <w:p>
+      <w:pPr>
+        <w:spacing w:after="160"/>
+        <w:ind w:left="720"/>
+      </w:pPr>
+      <w:r>
+        <w:rPr>
+          <w:i w:val="0"/>
+          <w:sz w:val="20"/>
+        </w:rPr>
+        <w:t>Nivel A · 73 puntos · técnicas útiles: SEM+DLS+zeta · licencia: verde</w:t>
+      </w:r>
+    </w:p>
+    <w:p>
+      <w:pPr>
         <w:pStyle w:val="Heading2"/>
       </w:pPr>
       <w:r>
@@ -3185,7 +4224,7 @@
       <w:r>
         <w:t xml:space="preserve">. </w:t>
       </w:r>
-      <w:hyperlink r:id="rId65">
+      <w:hyperlink r:id="rId84">
         <w:r>
           <w:rPr>
             <w:color w:val="0563C1"/>
@@ -3240,7 +4279,7 @@
       <w:r>
         <w:t xml:space="preserve">. </w:t>
       </w:r>
-      <w:hyperlink r:id="rId66">
+      <w:hyperlink r:id="rId85">
         <w:r>
           <w:rPr>
             <w:color w:val="0563C1"/>
@@ -3269,6 +4308,61 @@
         <w:ind w:left="720" w:hanging="720"/>
       </w:pPr>
       <w:r>
+        <w:t xml:space="preserve">Pramanik, A., Xu, Z., Ingram, N., Coletta, P. L., Millner, P. A., Tyler, A. I. I., &amp; Hughes, T. A. (2022). Hyaluronic-Acid-Tagged Cubosomes Deliver Cytotoxics Specifically to CD44-Positive Cancer Cells. </w:t>
+      </w:r>
+      <w:r>
+        <w:rPr>
+          <w:i/>
+        </w:rPr>
+        <w:t>Molecular Pharmaceutics</w:t>
+      </w:r>
+      <w:r>
+        <w:t xml:space="preserve">, </w:t>
+      </w:r>
+      <w:r>
+        <w:rPr>
+          <w:i/>
+        </w:rPr>
+        <w:t>19</w:t>
+      </w:r>
+      <w:r>
+        <w:t>(12)</w:t>
+      </w:r>
+      <w:r>
+        <w:t>, 4601-4611</w:t>
+      </w:r>
+      <w:r>
+        <w:t xml:space="preserve">. </w:t>
+      </w:r>
+      <w:hyperlink r:id="rId86">
+        <w:r>
+          <w:rPr>
+            <w:color w:val="0563C1"/>
+            <w:u w:val="single"/>
+          </w:rPr>
+          <w:t xml:space="preserve">https://doi.org/10.1021/acs.molpharmaceut.2c00439</w:t>
+        </w:r>
+      </w:hyperlink>
+    </w:p>
+    <w:p>
+      <w:pPr>
+        <w:spacing w:after="160"/>
+        <w:ind w:left="720"/>
+      </w:pPr>
+      <w:r>
+        <w:rPr>
+          <w:i w:val="0"/>
+          <w:sz w:val="20"/>
+        </w:rPr>
+        <w:t>Nivel B · 66 puntos · técnicas útiles: TEM+DLS+zeta+FTIR · licencia: verde</w:t>
+      </w:r>
+    </w:p>
+    <w:p>
+      <w:pPr>
+        <w:spacing w:after="0"/>
+        <w:ind w:left="720" w:hanging="720"/>
+      </w:pPr>
+      <w:r>
         <w:t xml:space="preserve">Ripoll, M., Martin, E., Enot, M., Robbe, O., Rapisarda, C., Nicolai, M. C., Deliot, A., Tabeling, P., Authelin, J. R., Nakach, M., &amp; Wils, P. (2022). Optimal self-assembly of lipid nanoparticles (LNP) in a ring micromixer. </w:t>
       </w:r>
       <w:r>
@@ -3295,7 +4389,7 @@
       <w:r>
         <w:t xml:space="preserve">. </w:t>
       </w:r>
-      <w:hyperlink r:id="rId67">
+      <w:hyperlink r:id="rId87">
         <w:r>
           <w:rPr>
             <w:color w:val="0563C1"/>
@@ -3350,7 +4444,7 @@
       <w:r>
         <w:t xml:space="preserve">. </w:t>
       </w:r>
-      <w:hyperlink r:id="rId68">
+      <w:hyperlink r:id="rId88">
         <w:r>
           <w:rPr>
             <w:color w:val="0563C1"/>
@@ -3410,7 +4504,7 @@
       <w:r>
         <w:t xml:space="preserve">. </w:t>
       </w:r>
-      <w:hyperlink r:id="rId69">
+      <w:hyperlink r:id="rId89">
         <w:r>
           <w:rPr>
             <w:color w:val="0563C1"/>
@@ -3430,24 +4524,16 @@
           <w:i w:val="0"/>
           <w:sz w:val="20"/>
         </w:rPr>
-        <w:t>Nivel B · 68 puntos · técnicas útiles: TEM+DLS+zeta · licencia: conflicto</w:t>
+        <w:t>Nivel B · 68 puntos · técnicas útiles: TEM+DLS+zeta · licencia: amarillo</w:t>
       </w:r>
     </w:p>
     <w:p>
       <w:pPr>
-        <w:pStyle w:val="Heading3"/>
-      </w:pPr>
-      <w:r>
-        <w:t>polymeric</w:t>
-      </w:r>
-    </w:p>
-    <w:p>
-      <w:pPr>
         <w:spacing w:after="0"/>
         <w:ind w:left="720" w:hanging="720"/>
       </w:pPr>
       <w:r>
-        <w:t xml:space="preserve">Abedi, F., Davaran, S., Hekmati, M., Akbarzadeh, A., Baradaran, B., &amp; Moghaddam, S. V. (2021). An improved method in fabrication of smart dual-responsive nanogels for controlled release of doxorubicin and curcumin in HT-29 colon cancer cells. </w:t>
+        <w:t xml:space="preserve">Kaur, R., Dennison, S. R., Burrow, A. J., Rudramurthy, S. M., Swami, R., Gorki, V., Katare, O. P., Kaushik, A., Singh, B., &amp; Singh, K. K. (2021). Nebulised surface-active hybrid nanoparticles of voriconazole for pulmonary Aspergillosis demonstrate clathrin-mediated cellular uptake, improved antifungal efficacy and lung retention. </w:t>
       </w:r>
       <w:r>
         <w:rPr>
@@ -3468,12 +4554,138 @@
         <w:t>(1)</w:t>
       </w:r>
       <w:r>
+        <w:t>, 19</w:t>
+      </w:r>
+      <w:r>
+        <w:t xml:space="preserve">. </w:t>
+      </w:r>
+      <w:hyperlink r:id="rId90">
+        <w:r>
+          <w:rPr>
+            <w:color w:val="0563C1"/>
+            <w:u w:val="single"/>
+          </w:rPr>
+          <w:t xml:space="preserve">https://doi.org/10.1186/s12951-020-00731-1</w:t>
+        </w:r>
+      </w:hyperlink>
+    </w:p>
+    <w:p>
+      <w:pPr>
+        <w:spacing w:after="160"/>
+        <w:ind w:left="720"/>
+      </w:pPr>
+      <w:r>
+        <w:rPr>
+          <w:i w:val="0"/>
+          <w:sz w:val="20"/>
+        </w:rPr>
+        <w:t>Nivel B · 66 puntos · técnicas útiles: SEM+DLS+zeta+XRD · licencia: verde</w:t>
+      </w:r>
+    </w:p>
+    <w:p>
+      <w:pPr>
+        <w:pStyle w:val="Heading3"/>
+      </w:pPr>
+      <w:r>
+        <w:t>SLN_NLC</w:t>
+      </w:r>
+    </w:p>
+    <w:p>
+      <w:pPr>
+        <w:spacing w:after="0"/>
+        <w:ind w:left="720" w:hanging="720"/>
+      </w:pPr>
+      <w:r>
+        <w:t xml:space="preserve">Nemattalab, M., Rohani, M., Evazalipour, M., &amp; Hesari, Z. (2022). Formulation of Cinnamon (Cinnamomum verum) oil loaded solid lipid nanoparticles and evaluation of its antibacterial activity against Multi-drug Resistant Escherichia coli. </w:t>
+      </w:r>
+      <w:r>
+        <w:rPr>
+          <w:i/>
+        </w:rPr>
+        <w:t>BMC Complementary Medicine and Therapies</w:t>
+      </w:r>
+      <w:r>
+        <w:t xml:space="preserve">, </w:t>
+      </w:r>
+      <w:r>
+        <w:rPr>
+          <w:i/>
+        </w:rPr>
+        <w:t>22</w:t>
+      </w:r>
+      <w:r>
+        <w:t>(1)</w:t>
+      </w:r>
+      <w:r>
+        <w:t>, 289</w:t>
+      </w:r>
+      <w:r>
+        <w:t xml:space="preserve">. </w:t>
+      </w:r>
+      <w:hyperlink r:id="rId91">
+        <w:r>
+          <w:rPr>
+            <w:color w:val="0563C1"/>
+            <w:u w:val="single"/>
+          </w:rPr>
+          <w:t xml:space="preserve">https://doi.org/10.1186/s12906-022-03775-y</w:t>
+        </w:r>
+      </w:hyperlink>
+    </w:p>
+    <w:p>
+      <w:pPr>
+        <w:spacing w:after="160"/>
+        <w:ind w:left="720"/>
+      </w:pPr>
+      <w:r>
+        <w:rPr>
+          <w:i w:val="0"/>
+          <w:sz w:val="20"/>
+        </w:rPr>
+        <w:t>Nivel B · 63 puntos · técnicas útiles: TEM+DLS+zeta+FTIR · licencia: verde</w:t>
+      </w:r>
+    </w:p>
+    <w:p>
+      <w:pPr>
+        <w:pStyle w:val="Heading3"/>
+      </w:pPr>
+      <w:r>
+        <w:t>polymeric</w:t>
+      </w:r>
+    </w:p>
+    <w:p>
+      <w:pPr>
+        <w:spacing w:after="0"/>
+        <w:ind w:left="720" w:hanging="720"/>
+      </w:pPr>
+      <w:r>
+        <w:t xml:space="preserve">Abedi, F., Davaran, S., Hekmati, M., Akbarzadeh, A., Baradaran, B., &amp; Moghaddam, S. V. (2021). An improved method in fabrication of smart dual-responsive nanogels for controlled release of doxorubicin and curcumin in HT-29 colon cancer cells. </w:t>
+      </w:r>
+      <w:r>
+        <w:rPr>
+          <w:i/>
+        </w:rPr>
+        <w:t>Journal of Nanobiotechnology</w:t>
+      </w:r>
+      <w:r>
+        <w:t xml:space="preserve">, </w:t>
+      </w:r>
+      <w:r>
+        <w:rPr>
+          <w:i/>
+        </w:rPr>
+        <w:t>19</w:t>
+      </w:r>
+      <w:r>
+        <w:t>(1)</w:t>
+      </w:r>
+      <w:r>
         <w:t>, 18</w:t>
       </w:r>
       <w:r>
         <w:t xml:space="preserve">. </w:t>
       </w:r>
-      <w:hyperlink r:id="rId70">
+      <w:hyperlink r:id="rId92">
         <w:r>
           <w:rPr>
             <w:color w:val="0563C1"/>
@@ -3528,7 +4740,7 @@
       <w:r>
         <w:t xml:space="preserve">. </w:t>
       </w:r>
-      <w:hyperlink r:id="rId71">
+      <w:hyperlink r:id="rId93">
         <w:r>
           <w:rPr>
             <w:color w:val="0563C1"/>

</xml_diff>

<commit_message>
Tareas por persona (Bryan, Carlos), politica de la puerta, hoja de verificacion del repositorio verde
- TAREAS_BRYAN.md y TAREAS_CARLOS.md (Carlos lee GitHub pero no escribe: entrega a Hector).
- verificacion_repositorio_verde.csv: 66 articulos CC BY con la muestra extraida para verificar.
- POLITICA_PUERTA.md: dos reglas para recuperar falsos negativos (valor por defecto, Hector puede cambiarlas).
- Licencias: la pagina del editor manda cuando las fuentes discrepan; 0 conflictos (66 verde, 19 amarillo).
- articles_curated.csv con columna doi_link (enlace de PMC si el articulo no tiene DOI).

Co-Authored-By: Claude Sonnet 5.5 <noreply@anthropic.com>
</commit_message>
<xml_diff>
--- a/curation/Repositorio_articulos.docx
+++ b/curation/Repositorio_articulos.docx
@@ -360,7 +360,7 @@
           <w:i w:val="0"/>
           <w:sz w:val="20"/>
         </w:rPr>
-        <w:t>Nivel S · 86 puntos · técnicas útiles: TEM+DLS+zeta+FTIR+DSC · licencia: conflicto</w:t>
+        <w:t>Nivel S · 86 puntos · técnicas útiles: TEM+DLS+zeta+FTIR+DSC · licencia: amarillo</w:t>
       </w:r>
     </w:p>
     <w:p>
@@ -1190,7 +1190,7 @@
           <w:i w:val="0"/>
           <w:sz w:val="20"/>
         </w:rPr>
-        <w:t>Nivel A · 73 puntos · técnicas útiles: SEM+DLS+zeta · licencia: conflicto</w:t>
+        <w:t>Nivel A · 73 puntos · técnicas útiles: SEM+DLS+zeta · licencia: amarillo</w:t>
       </w:r>
     </w:p>
     <w:p>

</xml_diff>

<commit_message>
Rescate del medio no declarado, regla de duplicados mas estricta, repositorio a 87 articulos
- rescue.py + prompt rescue_medium.md: busca por codigo las frases de medio y un agente barato decide; el codigo verifica la cita.
- finalize.py aplica el rescate (bandera medio_rescatado) tambien a articulos con una sola pasada.
- lineage.py: valores iguales solo cuentan como reutilizacion si hay laboratorio en comun.
- Repositorio: 87 articulos (68 CC BY, 19 NC/ND). Hoja de verificacion verde de Carlos regenerada (68 filas).
- TAREAS y ESTADO actualizados.

Co-Authored-By: Claude Sonnet 5.5 <noreply@anthropic.com>
</commit_message>
<xml_diff>
--- a/curation/Repositorio_articulos.docx
+++ b/curation/Repositorio_articulos.docx
@@ -823,6 +823,61 @@
         <w:ind w:left="720" w:hanging="720"/>
       </w:pPr>
       <w:r>
+        <w:t xml:space="preserve">Siewert, C. D., Haas, H., Cornet, V., Nogueira, S. S., Nawroth, T., Uebbing, L., Ziller, A., Al-Gousous, J., Radulescu, A., Schroer, M. A., Blanchet, C. E., Svergun, D. I., Radsak, M. P., Sahin, U., &amp; Langguth, P. (2020). Hybrid Biopolymer and Lipid Nanoparticles with Improved Transfection Efficacy for mRNA. </w:t>
+      </w:r>
+      <w:r>
+        <w:rPr>
+          <w:i/>
+        </w:rPr>
+        <w:t>Cells</w:t>
+      </w:r>
+      <w:r>
+        <w:t xml:space="preserve">, </w:t>
+      </w:r>
+      <w:r>
+        <w:rPr>
+          <w:i/>
+        </w:rPr>
+        <w:t>9</w:t>
+      </w:r>
+      <w:r>
+        <w:t>(9)</w:t>
+      </w:r>
+      <w:r>
+        <w:t>, 2034</w:t>
+      </w:r>
+      <w:r>
+        <w:t xml:space="preserve">. </w:t>
+      </w:r>
+      <w:hyperlink r:id="rId23">
+        <w:r>
+          <w:rPr>
+            <w:color w:val="0563C1"/>
+            <w:u w:val="single"/>
+          </w:rPr>
+          <w:t xml:space="preserve">https://doi.org/10.3390/cells9092034</w:t>
+        </w:r>
+      </w:hyperlink>
+    </w:p>
+    <w:p>
+      <w:pPr>
+        <w:spacing w:after="160"/>
+        <w:ind w:left="720"/>
+      </w:pPr>
+      <w:r>
+        <w:rPr>
+          <w:i w:val="0"/>
+          <w:sz w:val="20"/>
+        </w:rPr>
+        <w:t>Nivel A · 80 puntos · técnicas útiles: cryo+DLS+zeta · licencia: verde</w:t>
+      </w:r>
+    </w:p>
+    <w:p>
+      <w:pPr>
+        <w:spacing w:after="0"/>
+        <w:ind w:left="720" w:hanging="720"/>
+      </w:pPr>
+      <w:r>
         <w:t xml:space="preserve">Bazylińska, U., Wawrzyńczyk, D., Kulbacka, J., Picci, G., Manni, L. S., Handschin, S., Fornasier, M., Caltagirone, C., Mezzenga, R., &amp; Murgia, S. (2022). Hybrid Theranostic Cubosomes for Efficient NIR-Induced Photodynamic Therapy. </w:t>
       </w:r>
       <w:r>
@@ -849,7 +904,7 @@
       <w:r>
         <w:t xml:space="preserve">. </w:t>
       </w:r>
-      <w:hyperlink r:id="rId23">
+      <w:hyperlink r:id="rId24">
         <w:r>
           <w:rPr>
             <w:color w:val="0563C1"/>
@@ -901,7 +956,7 @@
       <w:r>
         <w:t xml:space="preserve">. </w:t>
       </w:r>
-      <w:hyperlink r:id="rId24">
+      <w:hyperlink r:id="rId25">
         <w:r>
           <w:rPr>
             <w:color w:val="0563C1"/>
@@ -956,7 +1011,7 @@
       <w:r>
         <w:t xml:space="preserve">. </w:t>
       </w:r>
-      <w:hyperlink r:id="rId25">
+      <w:hyperlink r:id="rId26">
         <w:r>
           <w:rPr>
             <w:color w:val="0563C1"/>
@@ -1011,7 +1066,7 @@
       <w:r>
         <w:t xml:space="preserve">. </w:t>
       </w:r>
-      <w:hyperlink r:id="rId26">
+      <w:hyperlink r:id="rId27">
         <w:r>
           <w:rPr>
             <w:color w:val="0563C1"/>
@@ -1063,7 +1118,7 @@
       <w:r>
         <w:t xml:space="preserve">. </w:t>
       </w:r>
-      <w:hyperlink r:id="rId27">
+      <w:hyperlink r:id="rId28">
         <w:r>
           <w:rPr>
             <w:color w:val="0563C1"/>
@@ -1118,7 +1173,7 @@
       <w:r>
         <w:t xml:space="preserve">. </w:t>
       </w:r>
-      <w:hyperlink r:id="rId28">
+      <w:hyperlink r:id="rId29">
         <w:r>
           <w:rPr>
             <w:color w:val="0563C1"/>
@@ -1147,6 +1202,49 @@
         <w:ind w:left="720" w:hanging="720"/>
       </w:pPr>
       <w:r>
+        <w:t xml:space="preserve">Yu, H., Sarkar, S., Shaw, Z. L., Dyett, B., Cai, X., Yap, S. L., Conn, C. E., Elbourne, A., Drummond, C. J., &amp; Zhai, J. (2024). Ionizable Lipid Containing Nanocarriers for Antimicrobial Agent Delivery. </w:t>
+      </w:r>
+      <w:r>
+        <w:rPr>
+          <w:i/>
+        </w:rPr>
+        <w:t>Small Science</w:t>
+      </w:r>
+      <w:r>
+        <w:t>, 2400145</w:t>
+      </w:r>
+      <w:r>
+        <w:t xml:space="preserve">. </w:t>
+      </w:r>
+      <w:hyperlink r:id="rId30">
+        <w:r>
+          <w:rPr>
+            <w:color w:val="0563C1"/>
+            <w:u w:val="single"/>
+          </w:rPr>
+          <w:t xml:space="preserve">https://doi.org/10.1002/smsc.202400145</w:t>
+        </w:r>
+      </w:hyperlink>
+    </w:p>
+    <w:p>
+      <w:pPr>
+        <w:spacing w:after="160"/>
+        <w:ind w:left="720"/>
+      </w:pPr>
+      <w:r>
+        <w:rPr>
+          <w:i w:val="0"/>
+          <w:sz w:val="20"/>
+        </w:rPr>
+        <w:t>Nivel A · 75 puntos · técnicas útiles: cryo+DLS+zeta · licencia: verde</w:t>
+      </w:r>
+    </w:p>
+    <w:p>
+      <w:pPr>
+        <w:spacing w:after="0"/>
+        <w:ind w:left="720" w:hanging="720"/>
+      </w:pPr>
+      <w:r>
         <w:t xml:space="preserve">Suwanpitak, K., Huanbutta, K., Weeranoppanant, N., Sriamornsak, P., Panpipat, C., &amp; Sangnim, T. (2024). Optimization of Lipid-Based Nanoparticles Formulation Loaded with Biological Product Using A Novel Design Vortex Tube Reactor via Flow Chemistry. </w:t>
       </w:r>
       <w:r>
@@ -1170,7 +1268,7 @@
       <w:r>
         <w:t xml:space="preserve">. </w:t>
       </w:r>
-      <w:hyperlink r:id="rId29">
+      <w:hyperlink r:id="rId31">
         <w:r>
           <w:rPr>
             <w:color w:val="0563C1"/>
@@ -1233,7 +1331,7 @@
       <w:r>
         <w:t xml:space="preserve">. </w:t>
       </w:r>
-      <w:hyperlink r:id="rId30">
+      <w:hyperlink r:id="rId32">
         <w:r>
           <w:rPr>
             <w:color w:val="0563C1"/>
@@ -1288,7 +1386,7 @@
       <w:r>
         <w:t xml:space="preserve">. </w:t>
       </w:r>
-      <w:hyperlink r:id="rId31">
+      <w:hyperlink r:id="rId33">
         <w:r>
           <w:rPr>
             <w:color w:val="0563C1"/>
@@ -1343,7 +1441,7 @@
       <w:r>
         <w:t xml:space="preserve">. </w:t>
       </w:r>
-      <w:hyperlink r:id="rId32">
+      <w:hyperlink r:id="rId34">
         <w:r>
           <w:rPr>
             <w:color w:val="0563C1"/>
@@ -1398,7 +1496,7 @@
       <w:r>
         <w:t xml:space="preserve">. </w:t>
       </w:r>
-      <w:hyperlink r:id="rId33">
+      <w:hyperlink r:id="rId35">
         <w:r>
           <w:rPr>
             <w:color w:val="0563C1"/>
@@ -1453,7 +1551,7 @@
       <w:r>
         <w:t xml:space="preserve">. </w:t>
       </w:r>
-      <w:hyperlink r:id="rId34">
+      <w:hyperlink r:id="rId36">
         <w:r>
           <w:rPr>
             <w:color w:val="0563C1"/>
@@ -1508,7 +1606,7 @@
       <w:r>
         <w:t xml:space="preserve">. </w:t>
       </w:r>
-      <w:hyperlink r:id="rId35">
+      <w:hyperlink r:id="rId37">
         <w:r>
           <w:rPr>
             <w:color w:val="0563C1"/>
@@ -1563,7 +1661,7 @@
       <w:r>
         <w:t xml:space="preserve">. </w:t>
       </w:r>
-      <w:hyperlink r:id="rId36">
+      <w:hyperlink r:id="rId38">
         <w:r>
           <w:rPr>
             <w:color w:val="0563C1"/>
@@ -1618,7 +1716,7 @@
       <w:r>
         <w:t xml:space="preserve">. </w:t>
       </w:r>
-      <w:hyperlink r:id="rId37">
+      <w:hyperlink r:id="rId39">
         <w:r>
           <w:rPr>
             <w:color w:val="0563C1"/>
@@ -1673,7 +1771,7 @@
       <w:r>
         <w:t xml:space="preserve">. </w:t>
       </w:r>
-      <w:hyperlink r:id="rId38">
+      <w:hyperlink r:id="rId40">
         <w:r>
           <w:rPr>
             <w:color w:val="0563C1"/>
@@ -1728,7 +1826,7 @@
       <w:r>
         <w:t xml:space="preserve">. </w:t>
       </w:r>
-      <w:hyperlink r:id="rId39">
+      <w:hyperlink r:id="rId41">
         <w:r>
           <w:rPr>
             <w:color w:val="0563C1"/>
@@ -1771,7 +1869,7 @@
       <w:r>
         <w:t xml:space="preserve">. </w:t>
       </w:r>
-      <w:hyperlink r:id="rId40">
+      <w:hyperlink r:id="rId42">
         <w:r>
           <w:rPr>
             <w:color w:val="0563C1"/>
@@ -1823,7 +1921,7 @@
       <w:r>
         <w:t xml:space="preserve">. </w:t>
       </w:r>
-      <w:hyperlink r:id="rId41">
+      <w:hyperlink r:id="rId43">
         <w:r>
           <w:rPr>
             <w:color w:val="0563C1"/>
@@ -1878,7 +1976,7 @@
       <w:r>
         <w:t xml:space="preserve">. </w:t>
       </w:r>
-      <w:hyperlink r:id="rId42">
+      <w:hyperlink r:id="rId44">
         <w:r>
           <w:rPr>
             <w:color w:val="0563C1"/>
@@ -1941,7 +2039,7 @@
       <w:r>
         <w:t xml:space="preserve">. </w:t>
       </w:r>
-      <w:hyperlink r:id="rId43">
+      <w:hyperlink r:id="rId45">
         <w:r>
           <w:rPr>
             <w:color w:val="0563C1"/>
@@ -1996,7 +2094,7 @@
       <w:r>
         <w:t xml:space="preserve">. </w:t>
       </w:r>
-      <w:hyperlink r:id="rId44">
+      <w:hyperlink r:id="rId46">
         <w:r>
           <w:rPr>
             <w:color w:val="0563C1"/>
@@ -2051,7 +2149,7 @@
       <w:r>
         <w:t xml:space="preserve">. </w:t>
       </w:r>
-      <w:hyperlink r:id="rId45">
+      <w:hyperlink r:id="rId47">
         <w:r>
           <w:rPr>
             <w:color w:val="0563C1"/>
@@ -2106,7 +2204,7 @@
       <w:r>
         <w:t xml:space="preserve">. </w:t>
       </w:r>
-      <w:hyperlink r:id="rId46">
+      <w:hyperlink r:id="rId48">
         <w:r>
           <w:rPr>
             <w:color w:val="0563C1"/>
@@ -2161,7 +2259,7 @@
       <w:r>
         <w:t xml:space="preserve">. </w:t>
       </w:r>
-      <w:hyperlink r:id="rId47">
+      <w:hyperlink r:id="rId49">
         <w:r>
           <w:rPr>
             <w:color w:val="0563C1"/>
@@ -2216,7 +2314,7 @@
       <w:r>
         <w:t xml:space="preserve">. </w:t>
       </w:r>
-      <w:hyperlink r:id="rId48">
+      <w:hyperlink r:id="rId50">
         <w:r>
           <w:rPr>
             <w:color w:val="0563C1"/>
@@ -2271,7 +2369,7 @@
       <w:r>
         <w:t xml:space="preserve">. </w:t>
       </w:r>
-      <w:hyperlink r:id="rId49">
+      <w:hyperlink r:id="rId51">
         <w:r>
           <w:rPr>
             <w:color w:val="0563C1"/>
@@ -2326,7 +2424,7 @@
       <w:r>
         <w:t xml:space="preserve">. </w:t>
       </w:r>
-      <w:hyperlink r:id="rId50">
+      <w:hyperlink r:id="rId52">
         <w:r>
           <w:rPr>
             <w:color w:val="0563C1"/>
@@ -2378,7 +2476,7 @@
       <w:r>
         <w:t xml:space="preserve">. </w:t>
       </w:r>
-      <w:hyperlink r:id="rId51">
+      <w:hyperlink r:id="rId53">
         <w:r>
           <w:rPr>
             <w:color w:val="0563C1"/>
@@ -2433,7 +2531,7 @@
       <w:r>
         <w:t xml:space="preserve">. </w:t>
       </w:r>
-      <w:hyperlink r:id="rId52">
+      <w:hyperlink r:id="rId54">
         <w:r>
           <w:rPr>
             <w:color w:val="0563C1"/>
@@ -2488,7 +2586,7 @@
       <w:r>
         <w:t xml:space="preserve">. </w:t>
       </w:r>
-      <w:hyperlink r:id="rId53">
+      <w:hyperlink r:id="rId55">
         <w:r>
           <w:rPr>
             <w:color w:val="0563C1"/>
@@ -2540,7 +2638,7 @@
       <w:r>
         <w:t xml:space="preserve">. </w:t>
       </w:r>
-      <w:hyperlink r:id="rId54">
+      <w:hyperlink r:id="rId56">
         <w:r>
           <w:rPr>
             <w:color w:val="0563C1"/>
@@ -2595,7 +2693,7 @@
       <w:r>
         <w:t xml:space="preserve">. </w:t>
       </w:r>
-      <w:hyperlink r:id="rId55">
+      <w:hyperlink r:id="rId57">
         <w:r>
           <w:rPr>
             <w:color w:val="0563C1"/>
@@ -2650,7 +2748,7 @@
       <w:r>
         <w:t xml:space="preserve">. </w:t>
       </w:r>
-      <w:hyperlink r:id="rId56">
+      <w:hyperlink r:id="rId58">
         <w:r>
           <w:rPr>
             <w:color w:val="0563C1"/>
@@ -2713,7 +2811,7 @@
       <w:r>
         <w:t xml:space="preserve">. </w:t>
       </w:r>
-      <w:hyperlink r:id="rId57">
+      <w:hyperlink r:id="rId59">
         <w:r>
           <w:rPr>
             <w:color w:val="0563C1"/>
@@ -2768,7 +2866,7 @@
       <w:r>
         <w:t xml:space="preserve">. </w:t>
       </w:r>
-      <w:hyperlink r:id="rId58">
+      <w:hyperlink r:id="rId60">
         <w:r>
           <w:rPr>
             <w:color w:val="0563C1"/>
@@ -2823,7 +2921,7 @@
       <w:r>
         <w:t xml:space="preserve">. </w:t>
       </w:r>
-      <w:hyperlink r:id="rId59">
+      <w:hyperlink r:id="rId61">
         <w:r>
           <w:rPr>
             <w:color w:val="0563C1"/>
@@ -2886,7 +2984,7 @@
       <w:r>
         <w:t xml:space="preserve">. </w:t>
       </w:r>
-      <w:hyperlink r:id="rId60">
+      <w:hyperlink r:id="rId62">
         <w:r>
           <w:rPr>
             <w:color w:val="0563C1"/>
@@ -2941,7 +3039,7 @@
       <w:r>
         <w:t xml:space="preserve">. </w:t>
       </w:r>
-      <w:hyperlink r:id="rId61">
+      <w:hyperlink r:id="rId63">
         <w:r>
           <w:rPr>
             <w:color w:val="0563C1"/>
@@ -2996,7 +3094,7 @@
       <w:r>
         <w:t xml:space="preserve">. </w:t>
       </w:r>
-      <w:hyperlink r:id="rId62">
+      <w:hyperlink r:id="rId64">
         <w:r>
           <w:rPr>
             <w:color w:val="0563C1"/>
@@ -3051,7 +3149,7 @@
       <w:r>
         <w:t xml:space="preserve">. </w:t>
       </w:r>
-      <w:hyperlink r:id="rId63">
+      <w:hyperlink r:id="rId65">
         <w:r>
           <w:rPr>
             <w:color w:val="0563C1"/>
@@ -3103,7 +3201,7 @@
       <w:r>
         <w:t xml:space="preserve">. </w:t>
       </w:r>
-      <w:hyperlink r:id="rId64">
+      <w:hyperlink r:id="rId66">
         <w:r>
           <w:rPr>
             <w:color w:val="0563C1"/>
@@ -3158,7 +3256,7 @@
       <w:r>
         <w:t xml:space="preserve">. </w:t>
       </w:r>
-      <w:hyperlink r:id="rId65">
+      <w:hyperlink r:id="rId67">
         <w:r>
           <w:rPr>
             <w:color w:val="0563C1"/>
@@ -3213,7 +3311,7 @@
       <w:r>
         <w:t xml:space="preserve">. </w:t>
       </w:r>
-      <w:hyperlink r:id="rId66">
+      <w:hyperlink r:id="rId68">
         <w:r>
           <w:rPr>
             <w:color w:val="0563C1"/>
@@ -3268,7 +3366,7 @@
       <w:r>
         <w:t xml:space="preserve">. </w:t>
       </w:r>
-      <w:hyperlink r:id="rId67">
+      <w:hyperlink r:id="rId69">
         <w:r>
           <w:rPr>
             <w:color w:val="0563C1"/>
@@ -3320,7 +3418,7 @@
       <w:r>
         <w:t xml:space="preserve">. </w:t>
       </w:r>
-      <w:hyperlink r:id="rId68">
+      <w:hyperlink r:id="rId70">
         <w:r>
           <w:rPr>
             <w:color w:val="0563C1"/>
@@ -3375,7 +3473,7 @@
       <w:r>
         <w:t xml:space="preserve">. </w:t>
       </w:r>
-      <w:hyperlink r:id="rId69">
+      <w:hyperlink r:id="rId71">
         <w:r>
           <w:rPr>
             <w:color w:val="0563C1"/>
@@ -3430,7 +3528,7 @@
       <w:r>
         <w:t xml:space="preserve">. </w:t>
       </w:r>
-      <w:hyperlink r:id="rId70">
+      <w:hyperlink r:id="rId72">
         <w:r>
           <w:rPr>
             <w:color w:val="0563C1"/>
@@ -3485,7 +3583,7 @@
       <w:r>
         <w:t xml:space="preserve">. </w:t>
       </w:r>
-      <w:hyperlink r:id="rId71">
+      <w:hyperlink r:id="rId73">
         <w:r>
           <w:rPr>
             <w:color w:val="0563C1"/>
@@ -3540,7 +3638,7 @@
       <w:r>
         <w:t xml:space="preserve">. </w:t>
       </w:r>
-      <w:hyperlink r:id="rId72">
+      <w:hyperlink r:id="rId74">
         <w:r>
           <w:rPr>
             <w:color w:val="0563C1"/>
@@ -3595,7 +3693,7 @@
       <w:r>
         <w:t xml:space="preserve">. </w:t>
       </w:r>
-      <w:hyperlink r:id="rId73">
+      <w:hyperlink r:id="rId75">
         <w:r>
           <w:rPr>
             <w:color w:val="0563C1"/>
@@ -3658,7 +3756,7 @@
       <w:r>
         <w:t xml:space="preserve">. </w:t>
       </w:r>
-      <w:hyperlink r:id="rId74">
+      <w:hyperlink r:id="rId76">
         <w:r>
           <w:rPr>
             <w:color w:val="0563C1"/>
@@ -3713,7 +3811,7 @@
       <w:r>
         <w:t xml:space="preserve">. </w:t>
       </w:r>
-      <w:hyperlink r:id="rId75">
+      <w:hyperlink r:id="rId77">
         <w:r>
           <w:rPr>
             <w:color w:val="0563C1"/>
@@ -3768,7 +3866,7 @@
       <w:r>
         <w:t xml:space="preserve">. </w:t>
       </w:r>
-      <w:hyperlink r:id="rId76">
+      <w:hyperlink r:id="rId78">
         <w:r>
           <w:rPr>
             <w:color w:val="0563C1"/>
@@ -3823,7 +3921,7 @@
       <w:r>
         <w:t xml:space="preserve">. </w:t>
       </w:r>
-      <w:hyperlink r:id="rId77">
+      <w:hyperlink r:id="rId79">
         <w:r>
           <w:rPr>
             <w:color w:val="0563C1"/>
@@ -3878,7 +3976,7 @@
       <w:r>
         <w:t xml:space="preserve">. </w:t>
       </w:r>
-      <w:hyperlink r:id="rId78">
+      <w:hyperlink r:id="rId80">
         <w:r>
           <w:rPr>
             <w:color w:val="0563C1"/>
@@ -3933,7 +4031,7 @@
       <w:r>
         <w:t xml:space="preserve">. </w:t>
       </w:r>
-      <w:hyperlink r:id="rId79">
+      <w:hyperlink r:id="rId81">
         <w:r>
           <w:rPr>
             <w:color w:val="0563C1"/>
@@ -3988,7 +4086,7 @@
       <w:r>
         <w:t xml:space="preserve">. </w:t>
       </w:r>
-      <w:hyperlink r:id="rId80">
+      <w:hyperlink r:id="rId82">
         <w:r>
           <w:rPr>
             <w:color w:val="0563C1"/>
@@ -4043,7 +4141,7 @@
       <w:r>
         <w:t xml:space="preserve">. </w:t>
       </w:r>
-      <w:hyperlink r:id="rId81">
+      <w:hyperlink r:id="rId83">
         <w:r>
           <w:rPr>
             <w:color w:val="0563C1"/>
@@ -4098,7 +4196,7 @@
       <w:r>
         <w:t xml:space="preserve">. </w:t>
       </w:r>
-      <w:hyperlink r:id="rId82">
+      <w:hyperlink r:id="rId84">
         <w:r>
           <w:rPr>
             <w:color w:val="0563C1"/>
@@ -4153,7 +4251,7 @@
       <w:r>
         <w:t xml:space="preserve">. </w:t>
       </w:r>
-      <w:hyperlink r:id="rId83">
+      <w:hyperlink r:id="rId85">
         <w:r>
           <w:rPr>
             <w:color w:val="0563C1"/>
@@ -4224,7 +4322,7 @@
       <w:r>
         <w:t xml:space="preserve">. </w:t>
       </w:r>
-      <w:hyperlink r:id="rId84">
+      <w:hyperlink r:id="rId86">
         <w:r>
           <w:rPr>
             <w:color w:val="0563C1"/>
@@ -4279,7 +4377,7 @@
       <w:r>
         <w:t xml:space="preserve">. </w:t>
       </w:r>
-      <w:hyperlink r:id="rId85">
+      <w:hyperlink r:id="rId87">
         <w:r>
           <w:rPr>
             <w:color w:val="0563C1"/>
@@ -4334,7 +4432,7 @@
       <w:r>
         <w:t xml:space="preserve">. </w:t>
       </w:r>
-      <w:hyperlink r:id="rId86">
+      <w:hyperlink r:id="rId88">
         <w:r>
           <w:rPr>
             <w:color w:val="0563C1"/>
@@ -4389,7 +4487,7 @@
       <w:r>
         <w:t xml:space="preserve">. </w:t>
       </w:r>
-      <w:hyperlink r:id="rId87">
+      <w:hyperlink r:id="rId89">
         <w:r>
           <w:rPr>
             <w:color w:val="0563C1"/>
@@ -4444,7 +4542,7 @@
       <w:r>
         <w:t xml:space="preserve">. </w:t>
       </w:r>
-      <w:hyperlink r:id="rId88">
+      <w:hyperlink r:id="rId90">
         <w:r>
           <w:rPr>
             <w:color w:val="0563C1"/>
@@ -4504,7 +4602,7 @@
       <w:r>
         <w:t xml:space="preserve">. </w:t>
       </w:r>
-      <w:hyperlink r:id="rId89">
+      <w:hyperlink r:id="rId91">
         <w:r>
           <w:rPr>
             <w:color w:val="0563C1"/>
@@ -4559,7 +4657,7 @@
       <w:r>
         <w:t xml:space="preserve">. </w:t>
       </w:r>
-      <w:hyperlink r:id="rId90">
+      <w:hyperlink r:id="rId92">
         <w:r>
           <w:rPr>
             <w:color w:val="0563C1"/>
@@ -4622,7 +4720,7 @@
       <w:r>
         <w:t xml:space="preserve">. </w:t>
       </w:r>
-      <w:hyperlink r:id="rId91">
+      <w:hyperlink r:id="rId93">
         <w:r>
           <w:rPr>
             <w:color w:val="0563C1"/>
@@ -4685,7 +4783,7 @@
       <w:r>
         <w:t xml:space="preserve">. </w:t>
       </w:r>
-      <w:hyperlink r:id="rId92">
+      <w:hyperlink r:id="rId94">
         <w:r>
           <w:rPr>
             <w:color w:val="0563C1"/>
@@ -4740,7 +4838,7 @@
       <w:r>
         <w:t xml:space="preserve">. </w:t>
       </w:r>
-      <w:hyperlink r:id="rId93">
+      <w:hyperlink r:id="rId95">
         <w:r>
           <w:rPr>
             <w:color w:val="0563C1"/>

</xml_diff>